<commit_message>
Update documentation: scenario sweep, column-level impact, 40 tests
Co-Authored-By: Claude Fable 5 <noreply@anthropic.com>
</commit_message>
<xml_diff>
--- a/docs/impactgraph-documentation.docx
+++ b/docs/impactgraph-documentation.docx
@@ -1,6 +1,6 @@
 
 <file path=word/document.xml><?xml version="1.0" encoding="utf-8"?>
-<w:document xmlns:wpc="http://schemas.microsoft.com/office/word/2010/wordprocessingCanvas" xmlns:cx="http://schemas.microsoft.com/office/drawing/2014/chartex" xmlns:cx1="http://schemas.microsoft.com/office/drawing/2015/9/8/chartex" xmlns:cx2="http://schemas.microsoft.com/office/drawing/2015/10/21/chartex" xmlns:cx3="http://schemas.microsoft.com/office/drawing/2016/5/9/chartex" xmlns:cx4="http://schemas.microsoft.com/office/drawing/2016/5/10/chartex" xmlns:cx5="http://schemas.microsoft.com/office/drawing/2016/5/11/chartex" xmlns:cx6="http://schemas.microsoft.com/office/drawing/2016/5/12/chartex" xmlns:cx7="http://schemas.microsoft.com/office/drawing/2016/5/13/chartex" xmlns:cx8="http://schemas.microsoft.com/office/drawing/2016/5/14/chartex" xmlns:mc="http://schemas.openxmlformats.org/markup-compatibility/2006" xmlns:aink="http://schemas.microsoft.com/office/drawing/2016/ink" xmlns:am3d="http://schemas.microsoft.com/office/drawing/2017/model3d" xmlns:o="urn:schemas-microsoft-com:office:office" xmlns:oel="http://schemas.microsoft.com/office/2019/extlst" xmlns:r="http://schemas.openxmlformats.org/officeDocument/2006/relationships" xmlns:m="http://schemas.openxmlformats.org/officeDocument/2006/math" xmlns:v="urn:schemas-microsoft-com:vml" xmlns:wp14="http://schemas.microsoft.com/office/word/2010/wordprocessingDrawing" xmlns:wp="http://schemas.openxmlformats.org/drawingml/2006/wordprocessingDrawing" xmlns:w10="urn:schemas-microsoft-com:office:word" xmlns:w="http://schemas.openxmlformats.org/wordprocessingml/2006/main" xmlns:w14="http://schemas.microsoft.com/office/word/2010/wordml" xmlns:w15="http://schemas.microsoft.com/office/word/2012/wordml" xmlns:w16cei="http://schemas.microsoft.com/office/word/2026/wordml/cei" xmlns:w16cex="http://schemas.microsoft.com/office/word/2018/wordml/cex" xmlns:w16cid="http://schemas.microsoft.com/office/word/2016/wordml/cid" xmlns:w16="http://schemas.microsoft.com/office/word/2018/wordml" xmlns:w16du="http://schemas.microsoft.com/office/word/2023/wordml/word16du" xmlns:w16sdtdh="http://schemas.microsoft.com/office/word/2020/wordml/sdtdatahash" xmlns:w16sdtfl="http://schemas.microsoft.com/office/word/2024/wordml/sdtformatlock" xmlns:w16se="http://schemas.microsoft.com/office/word/2015/wordml/symex" xmlns:wpg="http://schemas.microsoft.com/office/word/2010/wordprocessingGroup" xmlns:wpi="http://schemas.microsoft.com/office/word/2010/wordprocessingInk" xmlns:wne="http://schemas.microsoft.com/office/word/2006/wordml" xmlns:wps="http://schemas.microsoft.com/office/word/2010/wordprocessingShape" mc:Ignorable="w14 w15 w16se w16cid w16 w16cex w16sdtdh w16sdtfl w16du wp14">
+<w:document xmlns:wpc="http://schemas.microsoft.com/office/word/2010/wordprocessingCanvas" xmlns:cx="http://schemas.microsoft.com/office/drawing/2014/chartex" xmlns:cx1="http://schemas.microsoft.com/office/drawing/2015/9/8/chartex" xmlns:cx2="http://schemas.microsoft.com/office/drawing/2015/10/21/chartex" xmlns:cx3="http://schemas.microsoft.com/office/drawing/2016/5/9/chartex" xmlns:cx4="http://schemas.microsoft.com/office/drawing/2016/5/10/chartex" xmlns:cx5="http://schemas.microsoft.com/office/drawing/2016/5/11/chartex" xmlns:cx6="http://schemas.microsoft.com/office/drawing/2016/5/12/chartex" xmlns:cx7="http://schemas.microsoft.com/office/drawing/2016/5/13/chartex" xmlns:cx8="http://schemas.microsoft.com/office/drawing/2016/5/14/chartex" xmlns:mc="http://schemas.openxmlformats.org/markup-compatibility/2006" xmlns:aink="http://schemas.microsoft.com/office/drawing/2016/ink" xmlns:am3d="http://schemas.microsoft.com/office/drawing/2017/model3d" xmlns:o="urn:schemas-microsoft-com:office:office" xmlns:oel="http://schemas.microsoft.com/office/2019/extlst" xmlns:r="http://schemas.openxmlformats.org/officeDocument/2006/relationships" xmlns:m="http://schemas.openxmlformats.org/officeDocument/2006/math" xmlns:v="urn:schemas-microsoft-com:vml" xmlns:wp14="http://schemas.microsoft.com/office/word/2010/wordprocessingDrawing" xmlns:wp="http://schemas.openxmlformats.org/drawingml/2006/wordprocessingDrawing" xmlns:w10="urn:schemas-microsoft-com:office:word" xmlns:w="http://schemas.openxmlformats.org/wordprocessingml/2006/main" xmlns:w14="http://schemas.microsoft.com/office/word/2010/wordml" xmlns:w15="http://schemas.microsoft.com/office/word/2012/wordml" xmlns:w16cex="http://schemas.microsoft.com/office/word/2018/wordml/cex" xmlns:w16cid="http://schemas.microsoft.com/office/word/2016/wordml/cid" xmlns:w16="http://schemas.microsoft.com/office/word/2018/wordml" xmlns:w16du="http://schemas.microsoft.com/office/word/2023/wordml/word16du" xmlns:w16sdtdh="http://schemas.microsoft.com/office/word/2020/wordml/sdtdatahash" xmlns:w16sdtfl="http://schemas.microsoft.com/office/word/2024/wordml/sdtformatlock" xmlns:w16se="http://schemas.microsoft.com/office/word/2015/wordml/symex" xmlns:wpg="http://schemas.microsoft.com/office/word/2010/wordprocessingGroup" xmlns:wpi="http://schemas.microsoft.com/office/word/2010/wordprocessingInk" xmlns:wne="http://schemas.microsoft.com/office/word/2006/wordml" xmlns:wps="http://schemas.microsoft.com/office/word/2010/wordprocessingShape" mc:Ignorable="w14 w15 w16se w16cid w16 w16cex w16sdtdh w16sdtfl w16du wp14">
   <w:body>
     <w:p>
       <w:pPr>
@@ -105,7 +105,7 @@
     <w:sdt>
       <w:sdtPr>
         <w:alias w:val="Contents"/>
-        <w:id w:val="-907531756"/>
+        <w:id w:val="547341085"/>
       </w:sdtPr>
       <w:sdtEndPr/>
       <w:sdtContent>
@@ -133,7 +133,7 @@
           <w:r>
             <w:fldChar w:fldCharType="separate"/>
           </w:r>
-          <w:hyperlink w:anchor="_Toc238269447" w:history="1">
+          <w:hyperlink w:anchor="_Toc238270327" w:history="1">
             <w:r>
               <w:rPr>
                 <w:rStyle w:val="Hyperlink"/>
@@ -159,7 +159,7 @@
               <w:rPr>
                 <w:noProof/>
               </w:rPr>
-              <w:instrText xml:space="preserve"> PAGEREF _Toc238269447 \h </w:instrText>
+              <w:instrText xml:space="preserve"> PAGEREF _Toc238270327 \h </w:instrText>
             </w:r>
             <w:r>
               <w:rPr>
@@ -201,7 +201,7 @@
               <w14:ligatures w14:val="standardContextual"/>
             </w:rPr>
           </w:pPr>
-          <w:hyperlink w:anchor="_Toc238269448" w:history="1">
+          <w:hyperlink w:anchor="_Toc238270328" w:history="1">
             <w:r>
               <w:rPr>
                 <w:rStyle w:val="Hyperlink"/>
@@ -227,7 +227,7 @@
               <w:rPr>
                 <w:noProof/>
               </w:rPr>
-              <w:instrText xml:space="preserve"> PAGEREF _Toc238269448 \h </w:instrText>
+              <w:instrText xml:space="preserve"> PAGEREF _Toc238270328 \h </w:instrText>
             </w:r>
             <w:r>
               <w:rPr>
@@ -269,7 +269,7 @@
               <w14:ligatures w14:val="standardContextual"/>
             </w:rPr>
           </w:pPr>
-          <w:hyperlink w:anchor="_Toc238269449" w:history="1">
+          <w:hyperlink w:anchor="_Toc238270329" w:history="1">
             <w:r>
               <w:rPr>
                 <w:rStyle w:val="Hyperlink"/>
@@ -295,7 +295,7 @@
               <w:rPr>
                 <w:noProof/>
               </w:rPr>
-              <w:instrText xml:space="preserve"> PAGEREF _Toc238269449 \h </w:instrText>
+              <w:instrText xml:space="preserve"> PAGEREF _Toc238270329 \h </w:instrText>
             </w:r>
             <w:r>
               <w:rPr>
@@ -337,7 +337,7 @@
               <w14:ligatures w14:val="standardContextual"/>
             </w:rPr>
           </w:pPr>
-          <w:hyperlink w:anchor="_Toc238269450" w:history="1">
+          <w:hyperlink w:anchor="_Toc238270330" w:history="1">
             <w:r>
               <w:rPr>
                 <w:rStyle w:val="Hyperlink"/>
@@ -363,7 +363,7 @@
               <w:rPr>
                 <w:noProof/>
               </w:rPr>
-              <w:instrText xml:space="preserve"> PAGEREF _Toc238269450 \h </w:instrText>
+              <w:instrText xml:space="preserve"> PAGEREF _Toc238270330 \h </w:instrText>
             </w:r>
             <w:r>
               <w:rPr>
@@ -405,7 +405,7 @@
               <w14:ligatures w14:val="standardContextual"/>
             </w:rPr>
           </w:pPr>
-          <w:hyperlink w:anchor="_Toc238269451" w:history="1">
+          <w:hyperlink w:anchor="_Toc238270331" w:history="1">
             <w:r>
               <w:rPr>
                 <w:rStyle w:val="Hyperlink"/>
@@ -431,7 +431,7 @@
               <w:rPr>
                 <w:noProof/>
               </w:rPr>
-              <w:instrText xml:space="preserve"> PAGEREF _Toc238269451 \h </w:instrText>
+              <w:instrText xml:space="preserve"> PAGEREF _Toc238270331 \h </w:instrText>
             </w:r>
             <w:r>
               <w:rPr>
@@ -473,7 +473,7 @@
               <w14:ligatures w14:val="standardContextual"/>
             </w:rPr>
           </w:pPr>
-          <w:hyperlink w:anchor="_Toc238269452" w:history="1">
+          <w:hyperlink w:anchor="_Toc238270332" w:history="1">
             <w:r>
               <w:rPr>
                 <w:rStyle w:val="Hyperlink"/>
@@ -499,7 +499,7 @@
               <w:rPr>
                 <w:noProof/>
               </w:rPr>
-              <w:instrText xml:space="preserve"> PAGEREF _Toc238269452 \h </w:instrText>
+              <w:instrText xml:space="preserve"> PAGEREF _Toc238270332 \h </w:instrText>
             </w:r>
             <w:r>
               <w:rPr>
@@ -541,7 +541,7 @@
               <w14:ligatures w14:val="standardContextual"/>
             </w:rPr>
           </w:pPr>
-          <w:hyperlink w:anchor="_Toc238269453" w:history="1">
+          <w:hyperlink w:anchor="_Toc238270333" w:history="1">
             <w:r>
               <w:rPr>
                 <w:rStyle w:val="Hyperlink"/>
@@ -567,7 +567,7 @@
               <w:rPr>
                 <w:noProof/>
               </w:rPr>
-              <w:instrText xml:space="preserve"> PAGEREF _Toc238269453 \h </w:instrText>
+              <w:instrText xml:space="preserve"> PAGEREF _Toc238270333 \h </w:instrText>
             </w:r>
             <w:r>
               <w:rPr>
@@ -609,7 +609,7 @@
               <w14:ligatures w14:val="standardContextual"/>
             </w:rPr>
           </w:pPr>
-          <w:hyperlink w:anchor="_Toc238269454" w:history="1">
+          <w:hyperlink w:anchor="_Toc238270334" w:history="1">
             <w:r>
               <w:rPr>
                 <w:rStyle w:val="Hyperlink"/>
@@ -635,7 +635,7 @@
               <w:rPr>
                 <w:noProof/>
               </w:rPr>
-              <w:instrText xml:space="preserve"> PAGEREF _Toc238269454 \h </w:instrText>
+              <w:instrText xml:space="preserve"> PAGEREF _Toc238270334 \h </w:instrText>
             </w:r>
             <w:r>
               <w:rPr>
@@ -677,7 +677,7 @@
               <w14:ligatures w14:val="standardContextual"/>
             </w:rPr>
           </w:pPr>
-          <w:hyperlink w:anchor="_Toc238269455" w:history="1">
+          <w:hyperlink w:anchor="_Toc238270335" w:history="1">
             <w:r>
               <w:rPr>
                 <w:rStyle w:val="Hyperlink"/>
@@ -703,7 +703,7 @@
               <w:rPr>
                 <w:noProof/>
               </w:rPr>
-              <w:instrText xml:space="preserve"> PAGEREF _Toc238269455 \h </w:instrText>
+              <w:instrText xml:space="preserve"> PAGEREF _Toc238270335 \h </w:instrText>
             </w:r>
             <w:r>
               <w:rPr>
@@ -745,7 +745,7 @@
               <w14:ligatures w14:val="standardContextual"/>
             </w:rPr>
           </w:pPr>
-          <w:hyperlink w:anchor="_Toc238269456" w:history="1">
+          <w:hyperlink w:anchor="_Toc238270336" w:history="1">
             <w:r>
               <w:rPr>
                 <w:rStyle w:val="Hyperlink"/>
@@ -771,7 +771,7 @@
               <w:rPr>
                 <w:noProof/>
               </w:rPr>
-              <w:instrText xml:space="preserve"> PAGEREF _Toc238269456 \h </w:instrText>
+              <w:instrText xml:space="preserve"> PAGEREF _Toc238270336 \h </w:instrText>
             </w:r>
             <w:r>
               <w:rPr>
@@ -813,7 +813,7 @@
               <w14:ligatures w14:val="standardContextual"/>
             </w:rPr>
           </w:pPr>
-          <w:hyperlink w:anchor="_Toc238269457" w:history="1">
+          <w:hyperlink w:anchor="_Toc238270337" w:history="1">
             <w:r>
               <w:rPr>
                 <w:rStyle w:val="Hyperlink"/>
@@ -839,7 +839,7 @@
               <w:rPr>
                 <w:noProof/>
               </w:rPr>
-              <w:instrText xml:space="preserve"> PAGEREF _Toc238269457 \h </w:instrText>
+              <w:instrText xml:space="preserve"> PAGEREF _Toc238270337 \h </w:instrText>
             </w:r>
             <w:r>
               <w:rPr>
@@ -881,7 +881,7 @@
               <w14:ligatures w14:val="standardContextual"/>
             </w:rPr>
           </w:pPr>
-          <w:hyperlink w:anchor="_Toc238269458" w:history="1">
+          <w:hyperlink w:anchor="_Toc238270338" w:history="1">
             <w:r>
               <w:rPr>
                 <w:rStyle w:val="Hyperlink"/>
@@ -907,7 +907,7 @@
               <w:rPr>
                 <w:noProof/>
               </w:rPr>
-              <w:instrText xml:space="preserve"> PAGEREF _Toc238269458 \h </w:instrText>
+              <w:instrText xml:space="preserve"> PAGEREF _Toc238270338 \h </w:instrText>
             </w:r>
             <w:r>
               <w:rPr>
@@ -949,7 +949,7 @@
               <w14:ligatures w14:val="standardContextual"/>
             </w:rPr>
           </w:pPr>
-          <w:hyperlink w:anchor="_Toc238269459" w:history="1">
+          <w:hyperlink w:anchor="_Toc238270339" w:history="1">
             <w:r>
               <w:rPr>
                 <w:rStyle w:val="Hyperlink"/>
@@ -975,7 +975,7 @@
               <w:rPr>
                 <w:noProof/>
               </w:rPr>
-              <w:instrText xml:space="preserve"> PAGEREF _Toc238269459 \h </w:instrText>
+              <w:instrText xml:space="preserve"> PAGEREF _Toc238270339 \h </w:instrText>
             </w:r>
             <w:r>
               <w:rPr>
@@ -1017,7 +1017,7 @@
               <w14:ligatures w14:val="standardContextual"/>
             </w:rPr>
           </w:pPr>
-          <w:hyperlink w:anchor="_Toc238269460" w:history="1">
+          <w:hyperlink w:anchor="_Toc238270340" w:history="1">
             <w:r>
               <w:rPr>
                 <w:rStyle w:val="Hyperlink"/>
@@ -1043,7 +1043,7 @@
               <w:rPr>
                 <w:noProof/>
               </w:rPr>
-              <w:instrText xml:space="preserve"> PAGEREF _Toc238269460 \h </w:instrText>
+              <w:instrText xml:space="preserve"> PAGEREF _Toc238270340 \h </w:instrText>
             </w:r>
             <w:r>
               <w:rPr>
@@ -1085,7 +1085,7 @@
               <w14:ligatures w14:val="standardContextual"/>
             </w:rPr>
           </w:pPr>
-          <w:hyperlink w:anchor="_Toc238269461" w:history="1">
+          <w:hyperlink w:anchor="_Toc238270341" w:history="1">
             <w:r>
               <w:rPr>
                 <w:rStyle w:val="Hyperlink"/>
@@ -1111,7 +1111,7 @@
               <w:rPr>
                 <w:noProof/>
               </w:rPr>
-              <w:instrText xml:space="preserve"> PAGEREF _Toc238269461 \h </w:instrText>
+              <w:instrText xml:space="preserve"> PAGEREF _Toc238270341 \h </w:instrText>
             </w:r>
             <w:r>
               <w:rPr>
@@ -1153,7 +1153,7 @@
               <w14:ligatures w14:val="standardContextual"/>
             </w:rPr>
           </w:pPr>
-          <w:hyperlink w:anchor="_Toc238269462" w:history="1">
+          <w:hyperlink w:anchor="_Toc238270342" w:history="1">
             <w:r>
               <w:rPr>
                 <w:rStyle w:val="Hyperlink"/>
@@ -1179,7 +1179,7 @@
               <w:rPr>
                 <w:noProof/>
               </w:rPr>
-              <w:instrText xml:space="preserve"> PAGEREF _Toc238269462 \h </w:instrText>
+              <w:instrText xml:space="preserve"> PAGEREF _Toc238270342 \h </w:instrText>
             </w:r>
             <w:r>
               <w:rPr>
@@ -1221,7 +1221,7 @@
               <w14:ligatures w14:val="standardContextual"/>
             </w:rPr>
           </w:pPr>
-          <w:hyperlink w:anchor="_Toc238269463" w:history="1">
+          <w:hyperlink w:anchor="_Toc238270343" w:history="1">
             <w:r>
               <w:rPr>
                 <w:rStyle w:val="Hyperlink"/>
@@ -1247,7 +1247,7 @@
               <w:rPr>
                 <w:noProof/>
               </w:rPr>
-              <w:instrText xml:space="preserve"> PAGEREF _Toc238269463 \h </w:instrText>
+              <w:instrText xml:space="preserve"> PAGEREF _Toc238270343 \h </w:instrText>
             </w:r>
             <w:r>
               <w:rPr>
@@ -1289,7 +1289,7 @@
               <w14:ligatures w14:val="standardContextual"/>
             </w:rPr>
           </w:pPr>
-          <w:hyperlink w:anchor="_Toc238269464" w:history="1">
+          <w:hyperlink w:anchor="_Toc238270344" w:history="1">
             <w:r>
               <w:rPr>
                 <w:rStyle w:val="Hyperlink"/>
@@ -1315,7 +1315,7 @@
               <w:rPr>
                 <w:noProof/>
               </w:rPr>
-              <w:instrText xml:space="preserve"> PAGEREF _Toc238269464 \h </w:instrText>
+              <w:instrText xml:space="preserve"> PAGEREF _Toc238270344 \h </w:instrText>
             </w:r>
             <w:r>
               <w:rPr>
@@ -1357,7 +1357,7 @@
               <w14:ligatures w14:val="standardContextual"/>
             </w:rPr>
           </w:pPr>
-          <w:hyperlink w:anchor="_Toc238269465" w:history="1">
+          <w:hyperlink w:anchor="_Toc238270345" w:history="1">
             <w:r>
               <w:rPr>
                 <w:rStyle w:val="Hyperlink"/>
@@ -1383,7 +1383,7 @@
               <w:rPr>
                 <w:noProof/>
               </w:rPr>
-              <w:instrText xml:space="preserve"> PAGEREF _Toc238269465 \h </w:instrText>
+              <w:instrText xml:space="preserve"> PAGEREF _Toc238270345 \h </w:instrText>
             </w:r>
             <w:r>
               <w:rPr>
@@ -1425,7 +1425,7 @@
               <w14:ligatures w14:val="standardContextual"/>
             </w:rPr>
           </w:pPr>
-          <w:hyperlink w:anchor="_Toc238269466" w:history="1">
+          <w:hyperlink w:anchor="_Toc238270346" w:history="1">
             <w:r>
               <w:rPr>
                 <w:rStyle w:val="Hyperlink"/>
@@ -1433,7 +1433,7 @@
                 <w:bCs/>
                 <w:noProof/>
               </w:rPr>
-              <w:t>8.1 Automated suite (34 tests, all passing)</w:t>
+              <w:t>8.1 Automated suite (40 tests, all passing)</w:t>
             </w:r>
             <w:r>
               <w:rPr>
@@ -1451,7 +1451,7 @@
               <w:rPr>
                 <w:noProof/>
               </w:rPr>
-              <w:instrText xml:space="preserve"> PAGEREF _Toc238269466 \h </w:instrText>
+              <w:instrText xml:space="preserve"> PAGEREF _Toc238270346 \h </w:instrText>
             </w:r>
             <w:r>
               <w:rPr>
@@ -1493,7 +1493,7 @@
               <w14:ligatures w14:val="standardContextual"/>
             </w:rPr>
           </w:pPr>
-          <w:hyperlink w:anchor="_Toc238269467" w:history="1">
+          <w:hyperlink w:anchor="_Toc238270347" w:history="1">
             <w:r>
               <w:rPr>
                 <w:rStyle w:val="Hyperlink"/>
@@ -1519,7 +1519,7 @@
               <w:rPr>
                 <w:noProof/>
               </w:rPr>
-              <w:instrText xml:space="preserve"> PAGEREF _Toc238269467 \h </w:instrText>
+              <w:instrText xml:space="preserve"> PAGEREF _Toc238270347 \h </w:instrText>
             </w:r>
             <w:r>
               <w:rPr>
@@ -1561,7 +1561,7 @@
               <w14:ligatures w14:val="standardContextual"/>
             </w:rPr>
           </w:pPr>
-          <w:hyperlink w:anchor="_Toc238269468" w:history="1">
+          <w:hyperlink w:anchor="_Toc238270348" w:history="1">
             <w:r>
               <w:rPr>
                 <w:rStyle w:val="Hyperlink"/>
@@ -1587,7 +1587,7 @@
               <w:rPr>
                 <w:noProof/>
               </w:rPr>
-              <w:instrText xml:space="preserve"> PAGEREF _Toc238269468 \h </w:instrText>
+              <w:instrText xml:space="preserve"> PAGEREF _Toc238270348 \h </w:instrText>
             </w:r>
             <w:r>
               <w:rPr>
@@ -1629,7 +1629,7 @@
               <w14:ligatures w14:val="standardContextual"/>
             </w:rPr>
           </w:pPr>
-          <w:hyperlink w:anchor="_Toc238269469" w:history="1">
+          <w:hyperlink w:anchor="_Toc238270349" w:history="1">
             <w:r>
               <w:rPr>
                 <w:rStyle w:val="Hyperlink"/>
@@ -1655,7 +1655,7 @@
               <w:rPr>
                 <w:noProof/>
               </w:rPr>
-              <w:instrText xml:space="preserve"> PAGEREF _Toc238269469 \h </w:instrText>
+              <w:instrText xml:space="preserve"> PAGEREF _Toc238270349 \h </w:instrText>
             </w:r>
             <w:r>
               <w:rPr>
@@ -1697,7 +1697,7 @@
               <w14:ligatures w14:val="standardContextual"/>
             </w:rPr>
           </w:pPr>
-          <w:hyperlink w:anchor="_Toc238269470" w:history="1">
+          <w:hyperlink w:anchor="_Toc238270350" w:history="1">
             <w:r>
               <w:rPr>
                 <w:rStyle w:val="Hyperlink"/>
@@ -1723,7 +1723,7 @@
               <w:rPr>
                 <w:noProof/>
               </w:rPr>
-              <w:instrText xml:space="preserve"> PAGEREF _Toc238269470 \h </w:instrText>
+              <w:instrText xml:space="preserve"> PAGEREF _Toc238270350 \h </w:instrText>
             </w:r>
             <w:r>
               <w:rPr>
@@ -1740,7 +1740,7 @@
               <w:rPr>
                 <w:noProof/>
               </w:rPr>
-              <w:t>15</w:t>
+              <w:t>16</w:t>
             </w:r>
             <w:r>
               <w:rPr>
@@ -1765,7 +1765,7 @@
               <w14:ligatures w14:val="standardContextual"/>
             </w:rPr>
           </w:pPr>
-          <w:hyperlink w:anchor="_Toc238269471" w:history="1">
+          <w:hyperlink w:anchor="_Toc238270351" w:history="1">
             <w:r>
               <w:rPr>
                 <w:rStyle w:val="Hyperlink"/>
@@ -1791,7 +1791,7 @@
               <w:rPr>
                 <w:noProof/>
               </w:rPr>
-              <w:instrText xml:space="preserve"> PAGEREF _Toc238269471 \h </w:instrText>
+              <w:instrText xml:space="preserve"> PAGEREF _Toc238270351 \h </w:instrText>
             </w:r>
             <w:r>
               <w:rPr>
@@ -1808,7 +1808,7 @@
               <w:rPr>
                 <w:noProof/>
               </w:rPr>
-              <w:t>15</w:t>
+              <w:t>16</w:t>
             </w:r>
             <w:r>
               <w:rPr>
@@ -1833,7 +1833,7 @@
               <w14:ligatures w14:val="standardContextual"/>
             </w:rPr>
           </w:pPr>
-          <w:hyperlink w:anchor="_Toc238269472" w:history="1">
+          <w:hyperlink w:anchor="_Toc238270352" w:history="1">
             <w:r>
               <w:rPr>
                 <w:rStyle w:val="Hyperlink"/>
@@ -1859,7 +1859,7 @@
               <w:rPr>
                 <w:noProof/>
               </w:rPr>
-              <w:instrText xml:space="preserve"> PAGEREF _Toc238269472 \h </w:instrText>
+              <w:instrText xml:space="preserve"> PAGEREF _Toc238270352 \h </w:instrText>
             </w:r>
             <w:r>
               <w:rPr>
@@ -1876,7 +1876,7 @@
               <w:rPr>
                 <w:noProof/>
               </w:rPr>
-              <w:t>15</w:t>
+              <w:t>16</w:t>
             </w:r>
             <w:r>
               <w:rPr>
@@ -1901,7 +1901,7 @@
               <w14:ligatures w14:val="standardContextual"/>
             </w:rPr>
           </w:pPr>
-          <w:hyperlink w:anchor="_Toc238269473" w:history="1">
+          <w:hyperlink w:anchor="_Toc238270353" w:history="1">
             <w:r>
               <w:rPr>
                 <w:rStyle w:val="Hyperlink"/>
@@ -1927,7 +1927,7 @@
               <w:rPr>
                 <w:noProof/>
               </w:rPr>
-              <w:instrText xml:space="preserve"> PAGEREF _Toc238269473 \h </w:instrText>
+              <w:instrText xml:space="preserve"> PAGEREF _Toc238270353 \h </w:instrText>
             </w:r>
             <w:r>
               <w:rPr>
@@ -1944,7 +1944,7 @@
               <w:rPr>
                 <w:noProof/>
               </w:rPr>
-              <w:t>16</w:t>
+              <w:t>17</w:t>
             </w:r>
             <w:r>
               <w:rPr>
@@ -1969,7 +1969,7 @@
               <w14:ligatures w14:val="standardContextual"/>
             </w:rPr>
           </w:pPr>
-          <w:hyperlink w:anchor="_Toc238269474" w:history="1">
+          <w:hyperlink w:anchor="_Toc238270354" w:history="1">
             <w:r>
               <w:rPr>
                 <w:rStyle w:val="Hyperlink"/>
@@ -1995,7 +1995,7 @@
               <w:rPr>
                 <w:noProof/>
               </w:rPr>
-              <w:instrText xml:space="preserve"> PAGEREF _Toc238269474 \h </w:instrText>
+              <w:instrText xml:space="preserve"> PAGEREF _Toc238270354 \h </w:instrText>
             </w:r>
             <w:r>
               <w:rPr>
@@ -2012,7 +2012,7 @@
               <w:rPr>
                 <w:noProof/>
               </w:rPr>
-              <w:t>16</w:t>
+              <w:t>17</w:t>
             </w:r>
             <w:r>
               <w:rPr>
@@ -2037,7 +2037,7 @@
               <w14:ligatures w14:val="standardContextual"/>
             </w:rPr>
           </w:pPr>
-          <w:hyperlink w:anchor="_Toc238269475" w:history="1">
+          <w:hyperlink w:anchor="_Toc238270355" w:history="1">
             <w:r>
               <w:rPr>
                 <w:rStyle w:val="Hyperlink"/>
@@ -2063,7 +2063,7 @@
               <w:rPr>
                 <w:noProof/>
               </w:rPr>
-              <w:instrText xml:space="preserve"> PAGEREF _Toc238269475 \h </w:instrText>
+              <w:instrText xml:space="preserve"> PAGEREF _Toc238270355 \h </w:instrText>
             </w:r>
             <w:r>
               <w:rPr>
@@ -2080,7 +2080,7 @@
               <w:rPr>
                 <w:noProof/>
               </w:rPr>
-              <w:t>16</w:t>
+              <w:t>17</w:t>
             </w:r>
             <w:r>
               <w:rPr>
@@ -2105,7 +2105,7 @@
               <w14:ligatures w14:val="standardContextual"/>
             </w:rPr>
           </w:pPr>
-          <w:hyperlink w:anchor="_Toc238269476" w:history="1">
+          <w:hyperlink w:anchor="_Toc238270356" w:history="1">
             <w:r>
               <w:rPr>
                 <w:rStyle w:val="Hyperlink"/>
@@ -2131,7 +2131,7 @@
               <w:rPr>
                 <w:noProof/>
               </w:rPr>
-              <w:instrText xml:space="preserve"> PAGEREF _Toc238269476 \h </w:instrText>
+              <w:instrText xml:space="preserve"> PAGEREF _Toc238270356 \h </w:instrText>
             </w:r>
             <w:r>
               <w:rPr>
@@ -2148,7 +2148,7 @@
               <w:rPr>
                 <w:noProof/>
               </w:rPr>
-              <w:t>16</w:t>
+              <w:t>17</w:t>
             </w:r>
             <w:r>
               <w:rPr>
@@ -2173,7 +2173,7 @@
               <w14:ligatures w14:val="standardContextual"/>
             </w:rPr>
           </w:pPr>
-          <w:hyperlink w:anchor="_Toc238269477" w:history="1">
+          <w:hyperlink w:anchor="_Toc238270357" w:history="1">
             <w:r>
               <w:rPr>
                 <w:rStyle w:val="Hyperlink"/>
@@ -2199,7 +2199,7 @@
               <w:rPr>
                 <w:noProof/>
               </w:rPr>
-              <w:instrText xml:space="preserve"> PAGEREF _Toc238269477 \h </w:instrText>
+              <w:instrText xml:space="preserve"> PAGEREF _Toc238270357 \h </w:instrText>
             </w:r>
             <w:r>
               <w:rPr>
@@ -2216,7 +2216,7 @@
               <w:rPr>
                 <w:noProof/>
               </w:rPr>
-              <w:t>16</w:t>
+              <w:t>17</w:t>
             </w:r>
             <w:r>
               <w:rPr>
@@ -2241,7 +2241,7 @@
               <w14:ligatures w14:val="standardContextual"/>
             </w:rPr>
           </w:pPr>
-          <w:hyperlink w:anchor="_Toc238269478" w:history="1">
+          <w:hyperlink w:anchor="_Toc238270358" w:history="1">
             <w:r>
               <w:rPr>
                 <w:rStyle w:val="Hyperlink"/>
@@ -2267,7 +2267,7 @@
               <w:rPr>
                 <w:noProof/>
               </w:rPr>
-              <w:instrText xml:space="preserve"> PAGEREF _Toc238269478 \h </w:instrText>
+              <w:instrText xml:space="preserve"> PAGEREF _Toc238270358 \h </w:instrText>
             </w:r>
             <w:r>
               <w:rPr>
@@ -2284,7 +2284,7 @@
               <w:rPr>
                 <w:noProof/>
               </w:rPr>
-              <w:t>18</w:t>
+              <w:t>19</w:t>
             </w:r>
             <w:r>
               <w:rPr>
@@ -2309,7 +2309,7 @@
               <w14:ligatures w14:val="standardContextual"/>
             </w:rPr>
           </w:pPr>
-          <w:hyperlink w:anchor="_Toc238269479" w:history="1">
+          <w:hyperlink w:anchor="_Toc238270359" w:history="1">
             <w:r>
               <w:rPr>
                 <w:rStyle w:val="Hyperlink"/>
@@ -2335,7 +2335,7 @@
               <w:rPr>
                 <w:noProof/>
               </w:rPr>
-              <w:instrText xml:space="preserve"> PAGEREF _Toc238269479 \h </w:instrText>
+              <w:instrText xml:space="preserve"> PAGEREF _Toc238270359 \h </w:instrText>
             </w:r>
             <w:r>
               <w:rPr>
@@ -2352,7 +2352,7 @@
               <w:rPr>
                 <w:noProof/>
               </w:rPr>
-              <w:t>18</w:t>
+              <w:t>19</w:t>
             </w:r>
             <w:r>
               <w:rPr>
@@ -2377,7 +2377,7 @@
               <w14:ligatures w14:val="standardContextual"/>
             </w:rPr>
           </w:pPr>
-          <w:hyperlink w:anchor="_Toc238269480" w:history="1">
+          <w:hyperlink w:anchor="_Toc238270360" w:history="1">
             <w:r>
               <w:rPr>
                 <w:rStyle w:val="Hyperlink"/>
@@ -2403,7 +2403,7 @@
               <w:rPr>
                 <w:noProof/>
               </w:rPr>
-              <w:instrText xml:space="preserve"> PAGEREF _Toc238269480 \h </w:instrText>
+              <w:instrText xml:space="preserve"> PAGEREF _Toc238270360 \h </w:instrText>
             </w:r>
             <w:r>
               <w:rPr>
@@ -2420,7 +2420,7 @@
               <w:rPr>
                 <w:noProof/>
               </w:rPr>
-              <w:t>18</w:t>
+              <w:t>19</w:t>
             </w:r>
             <w:r>
               <w:rPr>
@@ -2469,7 +2469,7 @@
         <w:pStyle w:val="Heading1"/>
         <w:spacing w:before="360" w:after="160"/>
       </w:pPr>
-      <w:bookmarkStart w:id="0" w:name="_Toc238269447"/>
+      <w:bookmarkStart w:id="0" w:name="_Toc238270327"/>
       <w:r>
         <w:rPr>
           <w:b/>
@@ -2503,7 +2503,7 @@
           <w:left w:w="10" w:type="dxa"/>
           <w:right w:w="10" w:type="dxa"/>
         </w:tblCellMar>
-        <w:tblLook w:val="0000" w:firstRow="0" w:lastRow="0" w:firstColumn="0" w:lastColumn="0" w:noHBand="0" w:noVBand="0"/>
+        <w:tblLook w:val="04A0" w:firstRow="1" w:lastRow="0" w:firstColumn="1" w:lastColumn="0" w:noHBand="0" w:noVBand="1"/>
       </w:tblPr>
       <w:tblGrid>
         <w:gridCol w:w="9000"/>
@@ -2640,7 +2640,7 @@
         <w:t xml:space="preserve">Quality: </w:t>
       </w:r>
       <w:r>
-        <w:t>34 automated tests passing; end-to-end verified from the built wheel in a clean virtual environment; one real Windows bug (UTF-8 BOM) found and fixed during that pass.</w:t>
+        <w:t>40 automated tests passing; end-to-end verified from the built wheel in a clean virtual environment; one real Windows bug (UTF-8 BOM) found and fixed during that pass.</w:t>
       </w:r>
     </w:p>
     <w:p>
@@ -2668,7 +2668,7 @@
         <w:pStyle w:val="Heading1"/>
         <w:spacing w:before="360" w:after="160"/>
       </w:pPr>
-      <w:bookmarkStart w:id="1" w:name="_Toc238269448"/>
+      <w:bookmarkStart w:id="1" w:name="_Toc238270328"/>
       <w:r>
         <w:rPr>
           <w:b/>
@@ -2910,7 +2910,7 @@
           <w:left w:w="10" w:type="dxa"/>
           <w:right w:w="10" w:type="dxa"/>
         </w:tblCellMar>
-        <w:tblLook w:val="0000" w:firstRow="0" w:lastRow="0" w:firstColumn="0" w:lastColumn="0" w:noHBand="0" w:noVBand="0"/>
+        <w:tblLook w:val="04A0" w:firstRow="1" w:lastRow="0" w:firstColumn="1" w:lastColumn="0" w:noHBand="0" w:noVBand="1"/>
       </w:tblPr>
       <w:tblGrid>
         <w:gridCol w:w="9000"/>
@@ -2983,7 +2983,7 @@
         <w:pStyle w:val="Heading1"/>
         <w:spacing w:before="360" w:after="160"/>
       </w:pPr>
-      <w:bookmarkStart w:id="2" w:name="_Toc238269449"/>
+      <w:bookmarkStart w:id="2" w:name="_Toc238270329"/>
       <w:r>
         <w:rPr>
           <w:b/>
@@ -3017,7 +3017,7 @@
           <w:left w:w="10" w:type="dxa"/>
           <w:right w:w="10" w:type="dxa"/>
         </w:tblCellMar>
-        <w:tblLook w:val="0000" w:firstRow="0" w:lastRow="0" w:firstColumn="0" w:lastColumn="0" w:noHBand="0" w:noVBand="0"/>
+        <w:tblLook w:val="04A0" w:firstRow="1" w:lastRow="0" w:firstColumn="1" w:lastColumn="0" w:noHBand="0" w:noVBand="1"/>
       </w:tblPr>
       <w:tblGrid>
         <w:gridCol w:w="1500"/>
@@ -4215,6 +4215,83 @@
           </w:p>
         </w:tc>
       </w:tr>
+      <w:tr>
+        <w:tblPrEx>
+          <w:tblCellMar>
+            <w:top w:w="0" w:type="dxa"/>
+            <w:bottom w:w="0" w:type="dxa"/>
+          </w:tblCellMar>
+        </w:tblPrEx>
+        <w:tc>
+          <w:tcPr>
+            <w:tcW w:w="1500" w:type="dxa"/>
+            <w:tcMar>
+              <w:top w:w="80" w:type="dxa"/>
+              <w:left w:w="120" w:type="dxa"/>
+              <w:bottom w:w="80" w:type="dxa"/>
+              <w:right w:w="120" w:type="dxa"/>
+            </w:tcMar>
+          </w:tcPr>
+          <w:p>
+            <w:pPr>
+              <w:spacing w:after="40" w:line="252" w:lineRule="auto"/>
+            </w:pPr>
+            <w:r>
+              <w:rPr>
+                <w:sz w:val="20"/>
+                <w:szCs w:val="20"/>
+              </w:rPr>
+              <w:t>15. Scenario sweep</w:t>
+            </w:r>
+          </w:p>
+        </w:tc>
+        <w:tc>
+          <w:tcPr>
+            <w:tcW w:w="4000" w:type="dxa"/>
+            <w:tcMar>
+              <w:top w:w="80" w:type="dxa"/>
+              <w:left w:w="120" w:type="dxa"/>
+              <w:bottom w:w="80" w:type="dxa"/>
+              <w:right w:w="120" w:type="dxa"/>
+            </w:tcMar>
+          </w:tcPr>
+          <w:p>
+            <w:pPr>
+              <w:spacing w:after="40" w:line="252" w:lineRule="auto"/>
+            </w:pPr>
+            <w:r>
+              <w:rPr>
+                <w:sz w:val="20"/>
+                <w:szCs w:val="20"/>
+              </w:rPr>
+              <w:t>Ran impact for ten different targets (four columns, two models, a source, two functions, a file) and a real Python-function edit through impactgraph diff.</w:t>
+            </w:r>
+          </w:p>
+        </w:tc>
+        <w:tc>
+          <w:tcPr>
+            <w:tcW w:w="3500" w:type="dxa"/>
+            <w:tcMar>
+              <w:top w:w="80" w:type="dxa"/>
+              <w:left w:w="120" w:type="dxa"/>
+              <w:bottom w:w="80" w:type="dxa"/>
+              <w:right w:w="120" w:type="dxa"/>
+            </w:tcMar>
+          </w:tcPr>
+          <w:p>
+            <w:pPr>
+              <w:spacing w:after="40" w:line="252" w:lineRule="auto"/>
+            </w:pPr>
+            <w:r>
+              <w:rPr>
+                <w:sz w:val="20"/>
+                <w:szCs w:val="20"/>
+              </w:rPr>
+              <w:t>Proved the engine is generic, not tied to the customer_id example; found that column changes reported nothing (fixed: column-level propagation + rename heuristic) and that legacy Windows consoles crashed on glyphs (fixed: ASCII fallback). Test count → 40.</w:t>
+            </w:r>
+          </w:p>
+        </w:tc>
+      </w:tr>
     </w:tbl>
     <w:p>
       <w:pPr>
@@ -4226,7 +4303,7 @@
         <w:pStyle w:val="Heading1"/>
         <w:spacing w:before="360" w:after="160"/>
       </w:pPr>
-      <w:bookmarkStart w:id="3" w:name="_Toc238269450"/>
+      <w:bookmarkStart w:id="3" w:name="_Toc238270330"/>
       <w:r>
         <w:rPr>
           <w:b/>
@@ -4242,7 +4319,7 @@
         <w:pStyle w:val="Heading2"/>
         <w:spacing w:before="280" w:after="120"/>
       </w:pPr>
-      <w:bookmarkStart w:id="4" w:name="_Toc238269451"/>
+      <w:bookmarkStart w:id="4" w:name="_Toc238270331"/>
       <w:r>
         <w:rPr>
           <w:b/>
@@ -4268,7 +4345,7 @@
           <w:left w:w="10" w:type="dxa"/>
           <w:right w:w="10" w:type="dxa"/>
         </w:tblCellMar>
-        <w:tblLook w:val="0000" w:firstRow="0" w:lastRow="0" w:firstColumn="0" w:lastColumn="0" w:noHBand="0" w:noVBand="0"/>
+        <w:tblLook w:val="04A0" w:firstRow="1" w:lastRow="0" w:firstColumn="1" w:lastColumn="0" w:noHBand="0" w:noVBand="1"/>
       </w:tblPr>
       <w:tblGrid>
         <w:gridCol w:w="2600"/>
@@ -4680,7 +4757,7 @@
         <w:pStyle w:val="Heading2"/>
         <w:spacing w:before="280" w:after="120"/>
       </w:pPr>
-      <w:bookmarkStart w:id="5" w:name="_Toc238269452"/>
+      <w:bookmarkStart w:id="5" w:name="_Toc238270332"/>
       <w:r>
         <w:rPr>
           <w:b/>
@@ -4706,7 +4783,7 @@
           <w:left w:w="10" w:type="dxa"/>
           <w:right w:w="10" w:type="dxa"/>
         </w:tblCellMar>
-        <w:tblLook w:val="0000" w:firstRow="0" w:lastRow="0" w:firstColumn="0" w:lastColumn="0" w:noHBand="0" w:noVBand="0"/>
+        <w:tblLook w:val="04A0" w:firstRow="1" w:lastRow="0" w:firstColumn="1" w:lastColumn="0" w:noHBand="0" w:noVBand="1"/>
       </w:tblPr>
       <w:tblGrid>
         <w:gridCol w:w="2200"/>
@@ -5601,7 +5678,7 @@
         <w:pStyle w:val="Heading1"/>
         <w:spacing w:before="360" w:after="160"/>
       </w:pPr>
-      <w:bookmarkStart w:id="6" w:name="_Toc238269453"/>
+      <w:bookmarkStart w:id="6" w:name="_Toc238270333"/>
       <w:r>
         <w:rPr>
           <w:b/>
@@ -5617,7 +5694,7 @@
         <w:pStyle w:val="Heading2"/>
         <w:spacing w:before="280" w:after="120"/>
       </w:pPr>
-      <w:bookmarkStart w:id="7" w:name="_Toc238269454"/>
+      <w:bookmarkStart w:id="7" w:name="_Toc238270334"/>
       <w:r>
         <w:rPr>
           <w:b/>
@@ -5778,7 +5855,7 @@
         <w:pStyle w:val="Heading2"/>
         <w:spacing w:before="280" w:after="120"/>
       </w:pPr>
-      <w:bookmarkStart w:id="8" w:name="_Toc238269455"/>
+      <w:bookmarkStart w:id="8" w:name="_Toc238270335"/>
       <w:r>
         <w:rPr>
           <w:b/>
@@ -5804,7 +5881,7 @@
           <w:left w:w="10" w:type="dxa"/>
           <w:right w:w="10" w:type="dxa"/>
         </w:tblCellMar>
-        <w:tblLook w:val="0000" w:firstRow="0" w:lastRow="0" w:firstColumn="0" w:lastColumn="0" w:noHBand="0" w:noVBand="0"/>
+        <w:tblLook w:val="04A0" w:firstRow="1" w:lastRow="0" w:firstColumn="1" w:lastColumn="0" w:noHBand="0" w:noVBand="1"/>
       </w:tblPr>
       <w:tblGrid>
         <w:gridCol w:w="3539"/>
@@ -6709,7 +6786,7 @@
                 <w:sz w:val="20"/>
                 <w:szCs w:val="20"/>
               </w:rPr>
-              <w:t>34 pytest tests across 8 modules.</w:t>
+              <w:t>40 pytest tests across 10 modules.</w:t>
             </w:r>
           </w:p>
         </w:tc>
@@ -6837,7 +6914,7 @@
         <w:pStyle w:val="Heading2"/>
         <w:spacing w:before="280" w:after="120"/>
       </w:pPr>
-      <w:bookmarkStart w:id="9" w:name="_Toc238269456"/>
+      <w:bookmarkStart w:id="9" w:name="_Toc238270336"/>
       <w:r>
         <w:rPr>
           <w:b/>
@@ -6879,7 +6956,7 @@
           <w:left w:w="10" w:type="dxa"/>
           <w:right w:w="10" w:type="dxa"/>
         </w:tblCellMar>
-        <w:tblLook w:val="0000" w:firstRow="0" w:lastRow="0" w:firstColumn="0" w:lastColumn="0" w:noHBand="0" w:noVBand="0"/>
+        <w:tblLook w:val="04A0" w:firstRow="1" w:lastRow="0" w:firstColumn="1" w:lastColumn="0" w:noHBand="0" w:noVBand="1"/>
       </w:tblPr>
       <w:tblGrid>
         <w:gridCol w:w="1500"/>
@@ -7635,7 +7712,7 @@
         <w:pStyle w:val="Heading2"/>
         <w:spacing w:before="280" w:after="120"/>
       </w:pPr>
-      <w:bookmarkStart w:id="10" w:name="_Toc238269457"/>
+      <w:bookmarkStart w:id="10" w:name="_Toc238270337"/>
       <w:r>
         <w:rPr>
           <w:b/>
@@ -7720,7 +7797,7 @@
         <w:pStyle w:val="Heading2"/>
         <w:spacing w:before="280" w:after="120"/>
       </w:pPr>
-      <w:bookmarkStart w:id="11" w:name="_Toc238269458"/>
+      <w:bookmarkStart w:id="11" w:name="_Toc238270338"/>
       <w:r>
         <w:rPr>
           <w:b/>
@@ -7752,7 +7829,7 @@
         <w:pStyle w:val="Heading2"/>
         <w:spacing w:before="280" w:after="120"/>
       </w:pPr>
-      <w:bookmarkStart w:id="12" w:name="_Toc238269459"/>
+      <w:bookmarkStart w:id="12" w:name="_Toc238270339"/>
       <w:r>
         <w:rPr>
           <w:b/>
@@ -7784,7 +7861,7 @@
         <w:pStyle w:val="Heading1"/>
         <w:spacing w:before="360" w:after="160"/>
       </w:pPr>
-      <w:bookmarkStart w:id="13" w:name="_Toc238269460"/>
+      <w:bookmarkStart w:id="13" w:name="_Toc238270340"/>
       <w:r>
         <w:rPr>
           <w:b/>
@@ -8156,7 +8233,7 @@
         <w:pStyle w:val="Heading1"/>
         <w:spacing w:before="360" w:after="160"/>
       </w:pPr>
-      <w:bookmarkStart w:id="14" w:name="_Toc238269461"/>
+      <w:bookmarkStart w:id="14" w:name="_Toc238270341"/>
       <w:r>
         <w:rPr>
           <w:b/>
@@ -8172,7 +8249,7 @@
         <w:pStyle w:val="Heading2"/>
         <w:spacing w:before="280" w:after="120"/>
       </w:pPr>
-      <w:bookmarkStart w:id="15" w:name="_Toc238269462"/>
+      <w:bookmarkStart w:id="15" w:name="_Toc238270342"/>
       <w:r>
         <w:rPr>
           <w:b/>
@@ -8277,7 +8354,7 @@
         <w:pStyle w:val="Heading2"/>
         <w:spacing w:before="280" w:after="120"/>
       </w:pPr>
-      <w:bookmarkStart w:id="16" w:name="_Toc238269463"/>
+      <w:bookmarkStart w:id="16" w:name="_Toc238270343"/>
       <w:r>
         <w:rPr>
           <w:b/>
@@ -8303,7 +8380,7 @@
           <w:left w:w="10" w:type="dxa"/>
           <w:right w:w="10" w:type="dxa"/>
         </w:tblCellMar>
-        <w:tblLook w:val="0000" w:firstRow="0" w:lastRow="0" w:firstColumn="0" w:lastColumn="0" w:noHBand="0" w:noVBand="0"/>
+        <w:tblLook w:val="04A0" w:firstRow="1" w:lastRow="0" w:firstColumn="1" w:lastColumn="0" w:noHBand="0" w:noVBand="1"/>
       </w:tblPr>
       <w:tblGrid>
         <w:gridCol w:w="4300"/>
@@ -8664,7 +8741,7 @@
         <w:pStyle w:val="Heading2"/>
         <w:spacing w:before="280" w:after="120"/>
       </w:pPr>
-      <w:bookmarkStart w:id="17" w:name="_Toc238269464"/>
+      <w:bookmarkStart w:id="17" w:name="_Toc238270344"/>
       <w:r>
         <w:rPr>
           <w:b/>
@@ -8872,7 +8949,7 @@
         <w:pStyle w:val="Heading1"/>
         <w:spacing w:before="360" w:after="160"/>
       </w:pPr>
-      <w:bookmarkStart w:id="18" w:name="_Toc238269465"/>
+      <w:bookmarkStart w:id="18" w:name="_Toc238270345"/>
       <w:r>
         <w:rPr>
           <w:b/>
@@ -8896,14 +8973,14 @@
         <w:pStyle w:val="Heading2"/>
         <w:spacing w:before="280" w:after="120"/>
       </w:pPr>
-      <w:bookmarkStart w:id="19" w:name="_Toc238269466"/>
+      <w:bookmarkStart w:id="19" w:name="_Toc238270346"/>
       <w:r>
         <w:rPr>
           <w:b/>
           <w:bCs/>
           <w:color w:val="1F4E79"/>
         </w:rPr>
-        <w:t>8.1 Automated suite (34 tests, all passing)</w:t>
+        <w:t>8.1 Automated suite (40 tests, all passing)</w:t>
       </w:r>
       <w:bookmarkEnd w:id="19"/>
     </w:p>
@@ -8922,7 +8999,7 @@
           <w:left w:w="10" w:type="dxa"/>
           <w:right w:w="10" w:type="dxa"/>
         </w:tblCellMar>
-        <w:tblLook w:val="0000" w:firstRow="0" w:lastRow="0" w:firstColumn="0" w:lastColumn="0" w:noHBand="0" w:noVBand="0"/>
+        <w:tblLook w:val="04A0" w:firstRow="1" w:lastRow="0" w:firstColumn="1" w:lastColumn="0" w:noHBand="0" w:noVBand="1"/>
       </w:tblPr>
       <w:tblGrid>
         <w:gridCol w:w="2880"/>
@@ -9657,6 +9734,165 @@
           </w:p>
         </w:tc>
       </w:tr>
+      <w:tr>
+        <w:tblPrEx>
+          <w:tblCellMar>
+            <w:top w:w="0" w:type="dxa"/>
+            <w:bottom w:w="0" w:type="dxa"/>
+          </w:tblCellMar>
+        </w:tblPrEx>
+        <w:tc>
+          <w:tcPr>
+            <w:tcW w:w="2300" w:type="dxa"/>
+            <w:tcMar>
+              <w:top w:w="80" w:type="dxa"/>
+              <w:left w:w="120" w:type="dxa"/>
+              <w:bottom w:w="80" w:type="dxa"/>
+              <w:right w:w="120" w:type="dxa"/>
+            </w:tcMar>
+          </w:tcPr>
+          <w:p>
+            <w:pPr>
+              <w:spacing w:after="40" w:line="252" w:lineRule="auto"/>
+            </w:pPr>
+            <w:r>
+              <w:rPr>
+                <w:rFonts w:ascii="Consolas" w:eastAsia="Consolas" w:hAnsi="Consolas" w:cs="Consolas"/>
+                <w:sz w:val="20"/>
+                <w:szCs w:val="20"/>
+              </w:rPr>
+              <w:t>test_column_impact.py</w:t>
+            </w:r>
+          </w:p>
+        </w:tc>
+        <w:tc>
+          <w:tcPr>
+            <w:tcW w:w="800" w:type="dxa"/>
+            <w:tcMar>
+              <w:top w:w="80" w:type="dxa"/>
+              <w:left w:w="120" w:type="dxa"/>
+              <w:bottom w:w="80" w:type="dxa"/>
+              <w:right w:w="120" w:type="dxa"/>
+            </w:tcMar>
+          </w:tcPr>
+          <w:p>
+            <w:pPr>
+              <w:spacing w:after="40" w:line="252" w:lineRule="auto"/>
+            </w:pPr>
+            <w:r>
+              <w:rPr>
+                <w:sz w:val="20"/>
+                <w:szCs w:val="20"/>
+              </w:rPr>
+              <w:t>4</w:t>
+            </w:r>
+          </w:p>
+        </w:tc>
+        <w:tc>
+          <w:tcPr>
+            <w:tcW w:w="5900" w:type="dxa"/>
+            <w:tcMar>
+              <w:top w:w="80" w:type="dxa"/>
+              <w:left w:w="120" w:type="dxa"/>
+              <w:bottom w:w="80" w:type="dxa"/>
+              <w:right w:w="120" w:type="dxa"/>
+            </w:tcMar>
+          </w:tcPr>
+          <w:p>
+            <w:pPr>
+              <w:spacing w:after="40" w:line="252" w:lineRule="auto"/>
+            </w:pPr>
+            <w:r>
+              <w:rPr>
+                <w:sz w:val="20"/>
+                <w:szCs w:val="20"/>
+              </w:rPr>
+              <w:t>a column change reaches downstream models and exposures; same-named downstream columns flagged, unrelated siblings not; tree roots at the column; model change still flags its own columns.</w:t>
+            </w:r>
+          </w:p>
+        </w:tc>
+      </w:tr>
+      <w:tr>
+        <w:tblPrEx>
+          <w:tblCellMar>
+            <w:top w:w="0" w:type="dxa"/>
+            <w:bottom w:w="0" w:type="dxa"/>
+          </w:tblCellMar>
+        </w:tblPrEx>
+        <w:tc>
+          <w:tcPr>
+            <w:tcW w:w="2300" w:type="dxa"/>
+            <w:shd w:val="clear" w:color="auto" w:fill="FAFAFA"/>
+            <w:tcMar>
+              <w:top w:w="80" w:type="dxa"/>
+              <w:left w:w="120" w:type="dxa"/>
+              <w:bottom w:w="80" w:type="dxa"/>
+              <w:right w:w="120" w:type="dxa"/>
+            </w:tcMar>
+          </w:tcPr>
+          <w:p>
+            <w:pPr>
+              <w:spacing w:after="40" w:line="252" w:lineRule="auto"/>
+            </w:pPr>
+            <w:r>
+              <w:rPr>
+                <w:rFonts w:ascii="Consolas" w:eastAsia="Consolas" w:hAnsi="Consolas" w:cs="Consolas"/>
+                <w:sz w:val="20"/>
+                <w:szCs w:val="20"/>
+              </w:rPr>
+              <w:t>test_report.py</w:t>
+            </w:r>
+          </w:p>
+        </w:tc>
+        <w:tc>
+          <w:tcPr>
+            <w:tcW w:w="800" w:type="dxa"/>
+            <w:shd w:val="clear" w:color="auto" w:fill="FAFAFA"/>
+            <w:tcMar>
+              <w:top w:w="80" w:type="dxa"/>
+              <w:left w:w="120" w:type="dxa"/>
+              <w:bottom w:w="80" w:type="dxa"/>
+              <w:right w:w="120" w:type="dxa"/>
+            </w:tcMar>
+          </w:tcPr>
+          <w:p>
+            <w:pPr>
+              <w:spacing w:after="40" w:line="252" w:lineRule="auto"/>
+            </w:pPr>
+            <w:r>
+              <w:rPr>
+                <w:sz w:val="20"/>
+                <w:szCs w:val="20"/>
+              </w:rPr>
+              <w:t>2</w:t>
+            </w:r>
+          </w:p>
+        </w:tc>
+        <w:tc>
+          <w:tcPr>
+            <w:tcW w:w="5900" w:type="dxa"/>
+            <w:shd w:val="clear" w:color="auto" w:fill="FAFAFA"/>
+            <w:tcMar>
+              <w:top w:w="80" w:type="dxa"/>
+              <w:left w:w="120" w:type="dxa"/>
+              <w:bottom w:w="80" w:type="dxa"/>
+              <w:right w:w="120" w:type="dxa"/>
+            </w:tcMar>
+          </w:tcPr>
+          <w:p>
+            <w:pPr>
+              <w:spacing w:after="40" w:line="252" w:lineRule="auto"/>
+            </w:pPr>
+            <w:r>
+              <w:rPr>
+                <w:sz w:val="20"/>
+                <w:szCs w:val="20"/>
+              </w:rPr>
+              <w:t>report renders with glyphs on UTF-8 and falls back to ASCII on a cp1252 (legacy Windows) console without crashing.</w:t>
+            </w:r>
+          </w:p>
+        </w:tc>
+      </w:tr>
     </w:tbl>
     <w:p>
       <w:pPr>
@@ -9668,7 +9904,7 @@
         <w:pStyle w:val="Heading2"/>
         <w:spacing w:before="280" w:after="120"/>
       </w:pPr>
-      <w:bookmarkStart w:id="20" w:name="_Toc238269467"/>
+      <w:bookmarkStart w:id="20" w:name="_Toc238270347"/>
       <w:r>
         <w:rPr>
           <w:b/>
@@ -9749,7 +9985,7 @@
         <w:pStyle w:val="Heading2"/>
         <w:spacing w:before="280" w:after="120"/>
       </w:pPr>
-      <w:bookmarkStart w:id="21" w:name="_Toc238269468"/>
+      <w:bookmarkStart w:id="21" w:name="_Toc238270348"/>
       <w:r>
         <w:rPr>
           <w:b/>
@@ -9775,12 +10011,12 @@
           <w:left w:w="10" w:type="dxa"/>
           <w:right w:w="10" w:type="dxa"/>
         </w:tblCellMar>
-        <w:tblLook w:val="0000" w:firstRow="0" w:lastRow="0" w:firstColumn="0" w:lastColumn="0" w:noHBand="0" w:noVBand="0"/>
+        <w:tblLook w:val="04A0" w:firstRow="1" w:lastRow="0" w:firstColumn="1" w:lastColumn="0" w:noHBand="0" w:noVBand="1"/>
       </w:tblPr>
       <w:tblGrid>
-        <w:gridCol w:w="3400"/>
-        <w:gridCol w:w="2600"/>
-        <w:gridCol w:w="3000"/>
+        <w:gridCol w:w="3372"/>
+        <w:gridCol w:w="2649"/>
+        <w:gridCol w:w="2979"/>
       </w:tblGrid>
       <w:tr>
         <w:tblPrEx>
@@ -10188,6 +10424,254 @@
           </w:p>
         </w:tc>
       </w:tr>
+      <w:tr>
+        <w:tblPrEx>
+          <w:tblCellMar>
+            <w:top w:w="0" w:type="dxa"/>
+            <w:bottom w:w="0" w:type="dxa"/>
+          </w:tblCellMar>
+        </w:tblPrEx>
+        <w:tc>
+          <w:tcPr>
+            <w:tcW w:w="3400" w:type="dxa"/>
+            <w:tcMar>
+              <w:top w:w="80" w:type="dxa"/>
+              <w:left w:w="120" w:type="dxa"/>
+              <w:bottom w:w="80" w:type="dxa"/>
+              <w:right w:w="120" w:type="dxa"/>
+            </w:tcMar>
+          </w:tcPr>
+          <w:p>
+            <w:pPr>
+              <w:spacing w:after="40" w:line="252" w:lineRule="auto"/>
+            </w:pPr>
+            <w:r>
+              <w:rPr>
+                <w:sz w:val="20"/>
+                <w:szCs w:val="20"/>
+              </w:rPr>
+              <w:t>A column change reported nothing affected (column nodes only had an incoming contains edge).</w:t>
+            </w:r>
+          </w:p>
+        </w:tc>
+        <w:tc>
+          <w:tcPr>
+            <w:tcW w:w="2600" w:type="dxa"/>
+            <w:tcMar>
+              <w:top w:w="80" w:type="dxa"/>
+              <w:left w:w="120" w:type="dxa"/>
+              <w:bottom w:w="80" w:type="dxa"/>
+              <w:right w:w="120" w:type="dxa"/>
+            </w:tcMar>
+          </w:tcPr>
+          <w:p>
+            <w:pPr>
+              <w:spacing w:after="40" w:line="252" w:lineRule="auto"/>
+            </w:pPr>
+            <w:r>
+              <w:rPr>
+                <w:sz w:val="20"/>
+                <w:szCs w:val="20"/>
+              </w:rPr>
+              <w:t>Scenario sweep: impact column:fact_booking.amount returned an empty blast radius.</w:t>
+            </w:r>
+          </w:p>
+        </w:tc>
+        <w:tc>
+          <w:tcPr>
+            <w:tcW w:w="3000" w:type="dxa"/>
+            <w:tcMar>
+              <w:top w:w="80" w:type="dxa"/>
+              <w:left w:w="120" w:type="dxa"/>
+              <w:bottom w:w="80" w:type="dxa"/>
+              <w:right w:w="120" w:type="dxa"/>
+            </w:tcMar>
+          </w:tcPr>
+          <w:p>
+            <w:pPr>
+              <w:spacing w:after="40" w:line="252" w:lineRule="auto"/>
+            </w:pPr>
+            <w:r>
+              <w:rPr>
+                <w:sz w:val="20"/>
+                <w:szCs w:val="20"/>
+              </w:rPr>
+              <w:t>Column changes now propagate through the owning model/table to everything downstream and flag same-named downstream columns (rename heuristic).</w:t>
+            </w:r>
+          </w:p>
+        </w:tc>
+      </w:tr>
+      <w:tr>
+        <w:tblPrEx>
+          <w:tblCellMar>
+            <w:top w:w="0" w:type="dxa"/>
+            <w:bottom w:w="0" w:type="dxa"/>
+          </w:tblCellMar>
+        </w:tblPrEx>
+        <w:tc>
+          <w:tcPr>
+            <w:tcW w:w="3400" w:type="dxa"/>
+            <w:shd w:val="clear" w:color="auto" w:fill="FAFAFA"/>
+            <w:tcMar>
+              <w:top w:w="80" w:type="dxa"/>
+              <w:left w:w="120" w:type="dxa"/>
+              <w:bottom w:w="80" w:type="dxa"/>
+              <w:right w:w="120" w:type="dxa"/>
+            </w:tcMar>
+          </w:tcPr>
+          <w:p>
+            <w:pPr>
+              <w:spacing w:after="40" w:line="252" w:lineRule="auto"/>
+            </w:pPr>
+            <w:r>
+              <w:rPr>
+                <w:sz w:val="20"/>
+                <w:szCs w:val="20"/>
+              </w:rPr>
+              <w:t xml:space="preserve">UnicodeEncodeError on legacy Windows consoles (cp1252) — the report’s ⚠ / </w:t>
+            </w:r>
+            <w:r>
+              <w:rPr>
+                <w:sz w:val="20"/>
+                <w:szCs w:val="20"/>
+              </w:rPr>
+              <w:t>⬢</w:t>
+            </w:r>
+            <w:r>
+              <w:rPr>
+                <w:sz w:val="20"/>
+                <w:szCs w:val="20"/>
+              </w:rPr>
+              <w:t xml:space="preserve"> / ✓ glyphs crashed rich.</w:t>
+            </w:r>
+          </w:p>
+        </w:tc>
+        <w:tc>
+          <w:tcPr>
+            <w:tcW w:w="2600" w:type="dxa"/>
+            <w:shd w:val="clear" w:color="auto" w:fill="FAFAFA"/>
+            <w:tcMar>
+              <w:top w:w="80" w:type="dxa"/>
+              <w:left w:w="120" w:type="dxa"/>
+              <w:bottom w:w="80" w:type="dxa"/>
+              <w:right w:w="120" w:type="dxa"/>
+            </w:tcMar>
+          </w:tcPr>
+          <w:p>
+            <w:pPr>
+              <w:spacing w:after="40" w:line="252" w:lineRule="auto"/>
+            </w:pPr>
+            <w:r>
+              <w:rPr>
+                <w:sz w:val="20"/>
+                <w:szCs w:val="20"/>
+              </w:rPr>
+              <w:t>Running impactgraph diff from Git Bash.</w:t>
+            </w:r>
+          </w:p>
+        </w:tc>
+        <w:tc>
+          <w:tcPr>
+            <w:tcW w:w="3000" w:type="dxa"/>
+            <w:shd w:val="clear" w:color="auto" w:fill="FAFAFA"/>
+            <w:tcMar>
+              <w:top w:w="80" w:type="dxa"/>
+              <w:left w:w="120" w:type="dxa"/>
+              <w:bottom w:w="80" w:type="dxa"/>
+              <w:right w:w="120" w:type="dxa"/>
+            </w:tcMar>
+          </w:tcPr>
+          <w:p>
+            <w:pPr>
+              <w:spacing w:after="40" w:line="252" w:lineRule="auto"/>
+            </w:pPr>
+            <w:r>
+              <w:rPr>
+                <w:sz w:val="20"/>
+                <w:szCs w:val="20"/>
+              </w:rPr>
+              <w:t>ASCII fallback icons and markers when the console is not UTF-8.</w:t>
+            </w:r>
+          </w:p>
+        </w:tc>
+      </w:tr>
+      <w:tr>
+        <w:tblPrEx>
+          <w:tblCellMar>
+            <w:top w:w="0" w:type="dxa"/>
+            <w:bottom w:w="0" w:type="dxa"/>
+          </w:tblCellMar>
+        </w:tblPrEx>
+        <w:tc>
+          <w:tcPr>
+            <w:tcW w:w="3400" w:type="dxa"/>
+            <w:tcMar>
+              <w:top w:w="80" w:type="dxa"/>
+              <w:left w:w="120" w:type="dxa"/>
+              <w:bottom w:w="80" w:type="dxa"/>
+              <w:right w:w="120" w:type="dxa"/>
+            </w:tcMar>
+          </w:tcPr>
+          <w:p>
+            <w:pPr>
+              <w:spacing w:after="40" w:line="252" w:lineRule="auto"/>
+            </w:pPr>
+            <w:r>
+              <w:rPr>
+                <w:sz w:val="20"/>
+                <w:szCs w:val="20"/>
+              </w:rPr>
+              <w:t>rich interpreted the ASCII icon [dbt] as markup and stripped it.</w:t>
+            </w:r>
+          </w:p>
+        </w:tc>
+        <w:tc>
+          <w:tcPr>
+            <w:tcW w:w="2600" w:type="dxa"/>
+            <w:tcMar>
+              <w:top w:w="80" w:type="dxa"/>
+              <w:left w:w="120" w:type="dxa"/>
+              <w:bottom w:w="80" w:type="dxa"/>
+              <w:right w:w="120" w:type="dxa"/>
+            </w:tcMar>
+          </w:tcPr>
+          <w:p>
+            <w:pPr>
+              <w:spacing w:after="40" w:line="252" w:lineRule="auto"/>
+            </w:pPr>
+            <w:r>
+              <w:rPr>
+                <w:sz w:val="20"/>
+                <w:szCs w:val="20"/>
+              </w:rPr>
+              <w:t>The new cp1252 rendering test.</w:t>
+            </w:r>
+          </w:p>
+        </w:tc>
+        <w:tc>
+          <w:tcPr>
+            <w:tcW w:w="3000" w:type="dxa"/>
+            <w:tcMar>
+              <w:top w:w="80" w:type="dxa"/>
+              <w:left w:w="120" w:type="dxa"/>
+              <w:bottom w:w="80" w:type="dxa"/>
+              <w:right w:w="120" w:type="dxa"/>
+            </w:tcMar>
+          </w:tcPr>
+          <w:p>
+            <w:pPr>
+              <w:spacing w:after="40" w:line="252" w:lineRule="auto"/>
+            </w:pPr>
+            <w:r>
+              <w:rPr>
+                <w:sz w:val="20"/>
+                <w:szCs w:val="20"/>
+              </w:rPr>
+              <w:t>Escape icons and node names with rich.markup.escape.</w:t>
+            </w:r>
+          </w:p>
+        </w:tc>
+      </w:tr>
     </w:tbl>
     <w:p>
       <w:pPr>
@@ -10199,7 +10683,7 @@
         <w:pStyle w:val="Heading2"/>
         <w:spacing w:before="280" w:after="120"/>
       </w:pPr>
-      <w:bookmarkStart w:id="22" w:name="_Toc238269469"/>
+      <w:bookmarkStart w:id="22" w:name="_Toc238270349"/>
       <w:r>
         <w:rPr>
           <w:b/>
@@ -10280,7 +10764,7 @@
         <w:pStyle w:val="Heading1"/>
         <w:spacing w:before="360" w:after="160"/>
       </w:pPr>
-      <w:bookmarkStart w:id="23" w:name="_Toc238269470"/>
+      <w:bookmarkStart w:id="23" w:name="_Toc238270350"/>
       <w:r>
         <w:rPr>
           <w:b/>
@@ -10314,7 +10798,7 @@
           <w:left w:w="10" w:type="dxa"/>
           <w:right w:w="10" w:type="dxa"/>
         </w:tblCellMar>
-        <w:tblLook w:val="0000" w:firstRow="0" w:lastRow="0" w:firstColumn="0" w:lastColumn="0" w:noHBand="0" w:noVBand="0"/>
+        <w:tblLook w:val="04A0" w:firstRow="1" w:lastRow="0" w:firstColumn="1" w:lastColumn="0" w:noHBand="0" w:noVBand="1"/>
       </w:tblPr>
       <w:tblGrid>
         <w:gridCol w:w="2000"/>
@@ -10860,7 +11344,7 @@
         <w:pStyle w:val="Heading2"/>
         <w:spacing w:before="280" w:after="120"/>
       </w:pPr>
-      <w:bookmarkStart w:id="24" w:name="_Toc238269471"/>
+      <w:bookmarkStart w:id="24" w:name="_Toc238270351"/>
       <w:r>
         <w:rPr>
           <w:b/>
@@ -10956,7 +11440,7 @@
         <w:pStyle w:val="Heading2"/>
         <w:spacing w:before="280" w:after="120"/>
       </w:pPr>
-      <w:bookmarkStart w:id="25" w:name="_Toc238269472"/>
+      <w:bookmarkStart w:id="25" w:name="_Toc238270352"/>
       <w:r>
         <w:rPr>
           <w:b/>
@@ -11004,7 +11488,7 @@
         <w:t xml:space="preserve">Column-level lineage: </w:t>
       </w:r>
       <w:r>
-        <w:t>output columns only today; no column-to-column propagation through transformations.</w:t>
+        <w:t>a column change propagates through its owning model and flags same-named downstream columns (a rename heuristic that catches customer_key flowing from dim_customer to fact_booking), but there is no true column-to-column lineage through SQL expressions yet — a renamed-in-flight column (customer_id → customer_key) is found only at model level.</w:t>
       </w:r>
     </w:p>
     <w:p>
@@ -11032,7 +11516,7 @@
         <w:pStyle w:val="Heading1"/>
         <w:spacing w:before="360" w:after="160"/>
       </w:pPr>
-      <w:bookmarkStart w:id="26" w:name="_Toc238269473"/>
+      <w:bookmarkStart w:id="26" w:name="_Toc238270353"/>
       <w:r>
         <w:rPr>
           <w:b/>
@@ -11048,7 +11532,7 @@
         <w:pStyle w:val="Heading2"/>
         <w:spacing w:before="280" w:after="120"/>
       </w:pPr>
-      <w:bookmarkStart w:id="27" w:name="_Toc238269474"/>
+      <w:bookmarkStart w:id="27" w:name="_Toc238270354"/>
       <w:r>
         <w:rPr>
           <w:b/>
@@ -11116,7 +11600,7 @@
         <w:pStyle w:val="Heading2"/>
         <w:spacing w:before="280" w:after="120"/>
       </w:pPr>
-      <w:bookmarkStart w:id="28" w:name="_Toc238269475"/>
+      <w:bookmarkStart w:id="28" w:name="_Toc238270355"/>
       <w:r>
         <w:rPr>
           <w:b/>
@@ -11176,7 +11660,7 @@
         <w:spacing w:after="60" w:line="264" w:lineRule="auto"/>
       </w:pPr>
       <w:r>
-        <w:t>Git history: a452a29 “Initial release: impactgraph v0.1.0”; ced063a “Fix BOM handling in extractors; harden CLI explain; add AI-layer tests”.</w:t>
+        <w:t>Git history: a452a29 initial release; ced063a BOM fix + AI-layer tests; 7f9b303 documentation; 29c0378 column-level impact + ASCII console fallback; 3b1d1e9 markup escaping.</w:t>
       </w:r>
     </w:p>
     <w:p>
@@ -11184,7 +11668,7 @@
         <w:pStyle w:val="Heading2"/>
         <w:spacing w:before="280" w:after="120"/>
       </w:pPr>
-      <w:bookmarkStart w:id="29" w:name="_Toc238269476"/>
+      <w:bookmarkStart w:id="29" w:name="_Toc238270356"/>
       <w:r>
         <w:rPr>
           <w:b/>
@@ -11242,7 +11726,7 @@
         <w:pStyle w:val="Heading1"/>
         <w:spacing w:before="360" w:after="160"/>
       </w:pPr>
-      <w:bookmarkStart w:id="30" w:name="_Toc238269477"/>
+      <w:bookmarkStart w:id="30" w:name="_Toc238270357"/>
       <w:r>
         <w:rPr>
           <w:b/>
@@ -11268,7 +11752,7 @@
           <w:left w:w="10" w:type="dxa"/>
           <w:right w:w="10" w:type="dxa"/>
         </w:tblCellMar>
-        <w:tblLook w:val="0000" w:firstRow="0" w:lastRow="0" w:firstColumn="0" w:lastColumn="0" w:noHBand="0" w:noVBand="0"/>
+        <w:tblLook w:val="04A0" w:firstRow="1" w:lastRow="0" w:firstColumn="1" w:lastColumn="0" w:noHBand="0" w:noVBand="1"/>
       </w:tblPr>
       <w:tblGrid>
         <w:gridCol w:w="4400"/>
@@ -11849,7 +12333,7 @@
         <w:pStyle w:val="Heading1"/>
         <w:spacing w:before="360" w:after="160"/>
       </w:pPr>
-      <w:bookmarkStart w:id="31" w:name="_Toc238269478"/>
+      <w:bookmarkStart w:id="31" w:name="_Toc238270358"/>
       <w:r>
         <w:rPr>
           <w:b/>
@@ -11899,7 +12383,7 @@
           <w:sz w:val="19"/>
           <w:szCs w:val="19"/>
         </w:rPr>
-        <w:t>python -m pytest -q             # 34 tests</w:t>
+        <w:t>python -m pytest -q             # 40 tests</w:t>
       </w:r>
     </w:p>
     <w:p>
@@ -12080,7 +12564,7 @@
         <w:pStyle w:val="Heading1"/>
         <w:spacing w:before="360" w:after="160"/>
       </w:pPr>
-      <w:bookmarkStart w:id="32" w:name="_Toc238269479"/>
+      <w:bookmarkStart w:id="32" w:name="_Toc238270359"/>
       <w:r>
         <w:rPr>
           <w:b/>
@@ -12120,7 +12604,7 @@
         <w:pStyle w:val="Heading1"/>
         <w:spacing w:before="360" w:after="160"/>
       </w:pPr>
-      <w:bookmarkStart w:id="33" w:name="_Toc238269480"/>
+      <w:bookmarkStart w:id="33" w:name="_Toc238270360"/>
       <w:r>
         <w:rPr>
           <w:b/>
@@ -12224,7 +12708,7 @@
 </file>
 
 <file path=word/endnotes.xml><?xml version="1.0" encoding="utf-8"?>
-<w:endnotes xmlns:wpc="http://schemas.microsoft.com/office/word/2010/wordprocessingCanvas" xmlns:cx="http://schemas.microsoft.com/office/drawing/2014/chartex" xmlns:cx1="http://schemas.microsoft.com/office/drawing/2015/9/8/chartex" xmlns:cx2="http://schemas.microsoft.com/office/drawing/2015/10/21/chartex" xmlns:cx3="http://schemas.microsoft.com/office/drawing/2016/5/9/chartex" xmlns:cx4="http://schemas.microsoft.com/office/drawing/2016/5/10/chartex" xmlns:cx5="http://schemas.microsoft.com/office/drawing/2016/5/11/chartex" xmlns:cx6="http://schemas.microsoft.com/office/drawing/2016/5/12/chartex" xmlns:cx7="http://schemas.microsoft.com/office/drawing/2016/5/13/chartex" xmlns:cx8="http://schemas.microsoft.com/office/drawing/2016/5/14/chartex" xmlns:mc="http://schemas.openxmlformats.org/markup-compatibility/2006" xmlns:aink="http://schemas.microsoft.com/office/drawing/2016/ink" xmlns:am3d="http://schemas.microsoft.com/office/drawing/2017/model3d" xmlns:o="urn:schemas-microsoft-com:office:office" xmlns:oel="http://schemas.microsoft.com/office/2019/extlst" xmlns:r="http://schemas.openxmlformats.org/officeDocument/2006/relationships" xmlns:m="http://schemas.openxmlformats.org/officeDocument/2006/math" xmlns:v="urn:schemas-microsoft-com:vml" xmlns:wp14="http://schemas.microsoft.com/office/word/2010/wordprocessingDrawing" xmlns:wp="http://schemas.openxmlformats.org/drawingml/2006/wordprocessingDrawing" xmlns:w10="urn:schemas-microsoft-com:office:word" xmlns:w="http://schemas.openxmlformats.org/wordprocessingml/2006/main" xmlns:w14="http://schemas.microsoft.com/office/word/2010/wordml" xmlns:w15="http://schemas.microsoft.com/office/word/2012/wordml" xmlns:w16cei="http://schemas.microsoft.com/office/word/2026/wordml/cei" xmlns:w16cex="http://schemas.microsoft.com/office/word/2018/wordml/cex" xmlns:w16cid="http://schemas.microsoft.com/office/word/2016/wordml/cid" xmlns:w16="http://schemas.microsoft.com/office/word/2018/wordml" xmlns:w16du="http://schemas.microsoft.com/office/word/2023/wordml/word16du" xmlns:w16sdtdh="http://schemas.microsoft.com/office/word/2020/wordml/sdtdatahash" xmlns:w16sdtfl="http://schemas.microsoft.com/office/word/2024/wordml/sdtformatlock" xmlns:w16se="http://schemas.microsoft.com/office/word/2015/wordml/symex" xmlns:wpg="http://schemas.microsoft.com/office/word/2010/wordprocessingGroup" xmlns:wpi="http://schemas.microsoft.com/office/word/2010/wordprocessingInk" xmlns:wne="http://schemas.microsoft.com/office/word/2006/wordml" xmlns:wps="http://schemas.microsoft.com/office/word/2010/wordprocessingShape" mc:Ignorable="w14 w15 w16se w16cid w16 w16cex w16sdtdh w16sdtfl w16du wp14">
+<w:endnotes xmlns:wpc="http://schemas.microsoft.com/office/word/2010/wordprocessingCanvas" xmlns:cx="http://schemas.microsoft.com/office/drawing/2014/chartex" xmlns:cx1="http://schemas.microsoft.com/office/drawing/2015/9/8/chartex" xmlns:cx2="http://schemas.microsoft.com/office/drawing/2015/10/21/chartex" xmlns:cx3="http://schemas.microsoft.com/office/drawing/2016/5/9/chartex" xmlns:cx4="http://schemas.microsoft.com/office/drawing/2016/5/10/chartex" xmlns:cx5="http://schemas.microsoft.com/office/drawing/2016/5/11/chartex" xmlns:cx6="http://schemas.microsoft.com/office/drawing/2016/5/12/chartex" xmlns:cx7="http://schemas.microsoft.com/office/drawing/2016/5/13/chartex" xmlns:cx8="http://schemas.microsoft.com/office/drawing/2016/5/14/chartex" xmlns:mc="http://schemas.openxmlformats.org/markup-compatibility/2006" xmlns:aink="http://schemas.microsoft.com/office/drawing/2016/ink" xmlns:am3d="http://schemas.microsoft.com/office/drawing/2017/model3d" xmlns:o="urn:schemas-microsoft-com:office:office" xmlns:oel="http://schemas.microsoft.com/office/2019/extlst" xmlns:r="http://schemas.openxmlformats.org/officeDocument/2006/relationships" xmlns:m="http://schemas.openxmlformats.org/officeDocument/2006/math" xmlns:v="urn:schemas-microsoft-com:vml" xmlns:wp14="http://schemas.microsoft.com/office/word/2010/wordprocessingDrawing" xmlns:wp="http://schemas.openxmlformats.org/drawingml/2006/wordprocessingDrawing" xmlns:w10="urn:schemas-microsoft-com:office:word" xmlns:w="http://schemas.openxmlformats.org/wordprocessingml/2006/main" xmlns:w14="http://schemas.microsoft.com/office/word/2010/wordml" xmlns:w15="http://schemas.microsoft.com/office/word/2012/wordml" xmlns:w16cex="http://schemas.microsoft.com/office/word/2018/wordml/cex" xmlns:w16cid="http://schemas.microsoft.com/office/word/2016/wordml/cid" xmlns:w16="http://schemas.microsoft.com/office/word/2018/wordml" xmlns:w16du="http://schemas.microsoft.com/office/word/2023/wordml/word16du" xmlns:w16sdtdh="http://schemas.microsoft.com/office/word/2020/wordml/sdtdatahash" xmlns:w16sdtfl="http://schemas.microsoft.com/office/word/2024/wordml/sdtformatlock" xmlns:w16se="http://schemas.microsoft.com/office/word/2015/wordml/symex" xmlns:wpg="http://schemas.microsoft.com/office/word/2010/wordprocessingGroup" xmlns:wpi="http://schemas.microsoft.com/office/word/2010/wordprocessingInk" xmlns:wne="http://schemas.microsoft.com/office/word/2006/wordml" xmlns:wps="http://schemas.microsoft.com/office/word/2010/wordprocessingShape" mc:Ignorable="w14 w15 w16se w16cid w16 w16cex w16sdtdh w16sdtfl w16du wp14">
   <w:endnote w:type="separator" w:id="-1">
     <w:p>
       <w:r>
@@ -12243,7 +12727,7 @@
 </file>
 
 <file path=word/footer1.xml><?xml version="1.0" encoding="utf-8"?>
-<w:ftr xmlns:wpc="http://schemas.microsoft.com/office/word/2010/wordprocessingCanvas" xmlns:cx="http://schemas.microsoft.com/office/drawing/2014/chartex" xmlns:cx1="http://schemas.microsoft.com/office/drawing/2015/9/8/chartex" xmlns:cx2="http://schemas.microsoft.com/office/drawing/2015/10/21/chartex" xmlns:cx3="http://schemas.microsoft.com/office/drawing/2016/5/9/chartex" xmlns:cx4="http://schemas.microsoft.com/office/drawing/2016/5/10/chartex" xmlns:cx5="http://schemas.microsoft.com/office/drawing/2016/5/11/chartex" xmlns:cx6="http://schemas.microsoft.com/office/drawing/2016/5/12/chartex" xmlns:cx7="http://schemas.microsoft.com/office/drawing/2016/5/13/chartex" xmlns:cx8="http://schemas.microsoft.com/office/drawing/2016/5/14/chartex" xmlns:mc="http://schemas.openxmlformats.org/markup-compatibility/2006" xmlns:aink="http://schemas.microsoft.com/office/drawing/2016/ink" xmlns:am3d="http://schemas.microsoft.com/office/drawing/2017/model3d" xmlns:o="urn:schemas-microsoft-com:office:office" xmlns:oel="http://schemas.microsoft.com/office/2019/extlst" xmlns:r="http://schemas.openxmlformats.org/officeDocument/2006/relationships" xmlns:m="http://schemas.openxmlformats.org/officeDocument/2006/math" xmlns:v="urn:schemas-microsoft-com:vml" xmlns:wp14="http://schemas.microsoft.com/office/word/2010/wordprocessingDrawing" xmlns:wp="http://schemas.openxmlformats.org/drawingml/2006/wordprocessingDrawing" xmlns:w10="urn:schemas-microsoft-com:office:word" xmlns:w="http://schemas.openxmlformats.org/wordprocessingml/2006/main" xmlns:w14="http://schemas.microsoft.com/office/word/2010/wordml" xmlns:w15="http://schemas.microsoft.com/office/word/2012/wordml" xmlns:w16cei="http://schemas.microsoft.com/office/word/2026/wordml/cei" xmlns:w16cex="http://schemas.microsoft.com/office/word/2018/wordml/cex" xmlns:w16cid="http://schemas.microsoft.com/office/word/2016/wordml/cid" xmlns:w16="http://schemas.microsoft.com/office/word/2018/wordml" xmlns:w16du="http://schemas.microsoft.com/office/word/2023/wordml/word16du" xmlns:w16sdtdh="http://schemas.microsoft.com/office/word/2020/wordml/sdtdatahash" xmlns:w16sdtfl="http://schemas.microsoft.com/office/word/2024/wordml/sdtformatlock" xmlns:w16se="http://schemas.microsoft.com/office/word/2015/wordml/symex" xmlns:wpg="http://schemas.microsoft.com/office/word/2010/wordprocessingGroup" xmlns:wpi="http://schemas.microsoft.com/office/word/2010/wordprocessingInk" xmlns:wne="http://schemas.microsoft.com/office/word/2006/wordml" xmlns:wps="http://schemas.microsoft.com/office/word/2010/wordprocessingShape" mc:Ignorable="w14 w15 w16se w16cid w16 w16cex w16sdtdh w16sdtfl w16du wp14">
+<w:ftr xmlns:wpc="http://schemas.microsoft.com/office/word/2010/wordprocessingCanvas" xmlns:cx="http://schemas.microsoft.com/office/drawing/2014/chartex" xmlns:cx1="http://schemas.microsoft.com/office/drawing/2015/9/8/chartex" xmlns:cx2="http://schemas.microsoft.com/office/drawing/2015/10/21/chartex" xmlns:cx3="http://schemas.microsoft.com/office/drawing/2016/5/9/chartex" xmlns:cx4="http://schemas.microsoft.com/office/drawing/2016/5/10/chartex" xmlns:cx5="http://schemas.microsoft.com/office/drawing/2016/5/11/chartex" xmlns:cx6="http://schemas.microsoft.com/office/drawing/2016/5/12/chartex" xmlns:cx7="http://schemas.microsoft.com/office/drawing/2016/5/13/chartex" xmlns:cx8="http://schemas.microsoft.com/office/drawing/2016/5/14/chartex" xmlns:mc="http://schemas.openxmlformats.org/markup-compatibility/2006" xmlns:aink="http://schemas.microsoft.com/office/drawing/2016/ink" xmlns:am3d="http://schemas.microsoft.com/office/drawing/2017/model3d" xmlns:o="urn:schemas-microsoft-com:office:office" xmlns:oel="http://schemas.microsoft.com/office/2019/extlst" xmlns:r="http://schemas.openxmlformats.org/officeDocument/2006/relationships" xmlns:m="http://schemas.openxmlformats.org/officeDocument/2006/math" xmlns:v="urn:schemas-microsoft-com:vml" xmlns:wp14="http://schemas.microsoft.com/office/word/2010/wordprocessingDrawing" xmlns:wp="http://schemas.openxmlformats.org/drawingml/2006/wordprocessingDrawing" xmlns:w10="urn:schemas-microsoft-com:office:word" xmlns:w="http://schemas.openxmlformats.org/wordprocessingml/2006/main" xmlns:w14="http://schemas.microsoft.com/office/word/2010/wordml" xmlns:w15="http://schemas.microsoft.com/office/word/2012/wordml" xmlns:w16cex="http://schemas.microsoft.com/office/word/2018/wordml/cex" xmlns:w16cid="http://schemas.microsoft.com/office/word/2016/wordml/cid" xmlns:w16="http://schemas.microsoft.com/office/word/2018/wordml" xmlns:w16du="http://schemas.microsoft.com/office/word/2023/wordml/word16du" xmlns:w16sdtdh="http://schemas.microsoft.com/office/word/2020/wordml/sdtdatahash" xmlns:w16sdtfl="http://schemas.microsoft.com/office/word/2024/wordml/sdtformatlock" xmlns:w16se="http://schemas.microsoft.com/office/word/2015/wordml/symex" xmlns:wpg="http://schemas.microsoft.com/office/word/2010/wordprocessingGroup" xmlns:wpi="http://schemas.microsoft.com/office/word/2010/wordprocessingInk" xmlns:wne="http://schemas.microsoft.com/office/word/2006/wordml" xmlns:wps="http://schemas.microsoft.com/office/word/2010/wordprocessingShape" mc:Ignorable="w14 w15 w16se w16cid w16 w16cex w16sdtdh w16sdtfl w16du wp14">
   <w:p>
     <w:pPr>
       <w:jc w:val="center"/>
@@ -12351,7 +12835,7 @@
 </file>
 
 <file path=word/footnotes.xml><?xml version="1.0" encoding="utf-8"?>
-<w:footnotes xmlns:wpc="http://schemas.microsoft.com/office/word/2010/wordprocessingCanvas" xmlns:cx="http://schemas.microsoft.com/office/drawing/2014/chartex" xmlns:cx1="http://schemas.microsoft.com/office/drawing/2015/9/8/chartex" xmlns:cx2="http://schemas.microsoft.com/office/drawing/2015/10/21/chartex" xmlns:cx3="http://schemas.microsoft.com/office/drawing/2016/5/9/chartex" xmlns:cx4="http://schemas.microsoft.com/office/drawing/2016/5/10/chartex" xmlns:cx5="http://schemas.microsoft.com/office/drawing/2016/5/11/chartex" xmlns:cx6="http://schemas.microsoft.com/office/drawing/2016/5/12/chartex" xmlns:cx7="http://schemas.microsoft.com/office/drawing/2016/5/13/chartex" xmlns:cx8="http://schemas.microsoft.com/office/drawing/2016/5/14/chartex" xmlns:mc="http://schemas.openxmlformats.org/markup-compatibility/2006" xmlns:aink="http://schemas.microsoft.com/office/drawing/2016/ink" xmlns:am3d="http://schemas.microsoft.com/office/drawing/2017/model3d" xmlns:o="urn:schemas-microsoft-com:office:office" xmlns:oel="http://schemas.microsoft.com/office/2019/extlst" xmlns:r="http://schemas.openxmlformats.org/officeDocument/2006/relationships" xmlns:m="http://schemas.openxmlformats.org/officeDocument/2006/math" xmlns:v="urn:schemas-microsoft-com:vml" xmlns:wp14="http://schemas.microsoft.com/office/word/2010/wordprocessingDrawing" xmlns:wp="http://schemas.openxmlformats.org/drawingml/2006/wordprocessingDrawing" xmlns:w10="urn:schemas-microsoft-com:office:word" xmlns:w="http://schemas.openxmlformats.org/wordprocessingml/2006/main" xmlns:w14="http://schemas.microsoft.com/office/word/2010/wordml" xmlns:w15="http://schemas.microsoft.com/office/word/2012/wordml" xmlns:w16cei="http://schemas.microsoft.com/office/word/2026/wordml/cei" xmlns:w16cex="http://schemas.microsoft.com/office/word/2018/wordml/cex" xmlns:w16cid="http://schemas.microsoft.com/office/word/2016/wordml/cid" xmlns:w16="http://schemas.microsoft.com/office/word/2018/wordml" xmlns:w16du="http://schemas.microsoft.com/office/word/2023/wordml/word16du" xmlns:w16sdtdh="http://schemas.microsoft.com/office/word/2020/wordml/sdtdatahash" xmlns:w16sdtfl="http://schemas.microsoft.com/office/word/2024/wordml/sdtformatlock" xmlns:w16se="http://schemas.microsoft.com/office/word/2015/wordml/symex" xmlns:wpg="http://schemas.microsoft.com/office/word/2010/wordprocessingGroup" xmlns:wpi="http://schemas.microsoft.com/office/word/2010/wordprocessingInk" xmlns:wne="http://schemas.microsoft.com/office/word/2006/wordml" xmlns:wps="http://schemas.microsoft.com/office/word/2010/wordprocessingShape" mc:Ignorable="w14 w15 w16se w16cid w16 w16cex w16sdtdh w16sdtfl w16du wp14">
+<w:footnotes xmlns:wpc="http://schemas.microsoft.com/office/word/2010/wordprocessingCanvas" xmlns:cx="http://schemas.microsoft.com/office/drawing/2014/chartex" xmlns:cx1="http://schemas.microsoft.com/office/drawing/2015/9/8/chartex" xmlns:cx2="http://schemas.microsoft.com/office/drawing/2015/10/21/chartex" xmlns:cx3="http://schemas.microsoft.com/office/drawing/2016/5/9/chartex" xmlns:cx4="http://schemas.microsoft.com/office/drawing/2016/5/10/chartex" xmlns:cx5="http://schemas.microsoft.com/office/drawing/2016/5/11/chartex" xmlns:cx6="http://schemas.microsoft.com/office/drawing/2016/5/12/chartex" xmlns:cx7="http://schemas.microsoft.com/office/drawing/2016/5/13/chartex" xmlns:cx8="http://schemas.microsoft.com/office/drawing/2016/5/14/chartex" xmlns:mc="http://schemas.openxmlformats.org/markup-compatibility/2006" xmlns:aink="http://schemas.microsoft.com/office/drawing/2016/ink" xmlns:am3d="http://schemas.microsoft.com/office/drawing/2017/model3d" xmlns:o="urn:schemas-microsoft-com:office:office" xmlns:oel="http://schemas.microsoft.com/office/2019/extlst" xmlns:r="http://schemas.openxmlformats.org/officeDocument/2006/relationships" xmlns:m="http://schemas.openxmlformats.org/officeDocument/2006/math" xmlns:v="urn:schemas-microsoft-com:vml" xmlns:wp14="http://schemas.microsoft.com/office/word/2010/wordprocessingDrawing" xmlns:wp="http://schemas.openxmlformats.org/drawingml/2006/wordprocessingDrawing" xmlns:w10="urn:schemas-microsoft-com:office:word" xmlns:w="http://schemas.openxmlformats.org/wordprocessingml/2006/main" xmlns:w14="http://schemas.microsoft.com/office/word/2010/wordml" xmlns:w15="http://schemas.microsoft.com/office/word/2012/wordml" xmlns:w16cex="http://schemas.microsoft.com/office/word/2018/wordml/cex" xmlns:w16cid="http://schemas.microsoft.com/office/word/2016/wordml/cid" xmlns:w16="http://schemas.microsoft.com/office/word/2018/wordml" xmlns:w16du="http://schemas.microsoft.com/office/word/2023/wordml/word16du" xmlns:w16sdtdh="http://schemas.microsoft.com/office/word/2020/wordml/sdtdatahash" xmlns:w16sdtfl="http://schemas.microsoft.com/office/word/2024/wordml/sdtformatlock" xmlns:w16se="http://schemas.microsoft.com/office/word/2015/wordml/symex" xmlns:wpg="http://schemas.microsoft.com/office/word/2010/wordprocessingGroup" xmlns:wpi="http://schemas.microsoft.com/office/word/2010/wordprocessingInk" xmlns:wne="http://schemas.microsoft.com/office/word/2006/wordml" xmlns:wps="http://schemas.microsoft.com/office/word/2010/wordprocessingShape" mc:Ignorable="w14 w15 w16se w16cid w16 w16cex w16sdtdh w16sdtfl w16du wp14">
   <w:footnote w:type="separator" w:id="-1">
     <w:p>
       <w:r>
@@ -12370,7 +12854,7 @@
 </file>
 
 <file path=word/header1.xml><?xml version="1.0" encoding="utf-8"?>
-<w:hdr xmlns:wpc="http://schemas.microsoft.com/office/word/2010/wordprocessingCanvas" xmlns:cx="http://schemas.microsoft.com/office/drawing/2014/chartex" xmlns:cx1="http://schemas.microsoft.com/office/drawing/2015/9/8/chartex" xmlns:cx2="http://schemas.microsoft.com/office/drawing/2015/10/21/chartex" xmlns:cx3="http://schemas.microsoft.com/office/drawing/2016/5/9/chartex" xmlns:cx4="http://schemas.microsoft.com/office/drawing/2016/5/10/chartex" xmlns:cx5="http://schemas.microsoft.com/office/drawing/2016/5/11/chartex" xmlns:cx6="http://schemas.microsoft.com/office/drawing/2016/5/12/chartex" xmlns:cx7="http://schemas.microsoft.com/office/drawing/2016/5/13/chartex" xmlns:cx8="http://schemas.microsoft.com/office/drawing/2016/5/14/chartex" xmlns:mc="http://schemas.openxmlformats.org/markup-compatibility/2006" xmlns:aink="http://schemas.microsoft.com/office/drawing/2016/ink" xmlns:am3d="http://schemas.microsoft.com/office/drawing/2017/model3d" xmlns:o="urn:schemas-microsoft-com:office:office" xmlns:oel="http://schemas.microsoft.com/office/2019/extlst" xmlns:r="http://schemas.openxmlformats.org/officeDocument/2006/relationships" xmlns:m="http://schemas.openxmlformats.org/officeDocument/2006/math" xmlns:v="urn:schemas-microsoft-com:vml" xmlns:wp14="http://schemas.microsoft.com/office/word/2010/wordprocessingDrawing" xmlns:wp="http://schemas.openxmlformats.org/drawingml/2006/wordprocessingDrawing" xmlns:w10="urn:schemas-microsoft-com:office:word" xmlns:w="http://schemas.openxmlformats.org/wordprocessingml/2006/main" xmlns:w14="http://schemas.microsoft.com/office/word/2010/wordml" xmlns:w15="http://schemas.microsoft.com/office/word/2012/wordml" xmlns:w16cei="http://schemas.microsoft.com/office/word/2026/wordml/cei" xmlns:w16cex="http://schemas.microsoft.com/office/word/2018/wordml/cex" xmlns:w16cid="http://schemas.microsoft.com/office/word/2016/wordml/cid" xmlns:w16="http://schemas.microsoft.com/office/word/2018/wordml" xmlns:w16du="http://schemas.microsoft.com/office/word/2023/wordml/word16du" xmlns:w16sdtdh="http://schemas.microsoft.com/office/word/2020/wordml/sdtdatahash" xmlns:w16sdtfl="http://schemas.microsoft.com/office/word/2024/wordml/sdtformatlock" xmlns:w16se="http://schemas.microsoft.com/office/word/2015/wordml/symex" xmlns:wpg="http://schemas.microsoft.com/office/word/2010/wordprocessingGroup" xmlns:wpi="http://schemas.microsoft.com/office/word/2010/wordprocessingInk" xmlns:wne="http://schemas.microsoft.com/office/word/2006/wordml" xmlns:wps="http://schemas.microsoft.com/office/word/2010/wordprocessingShape" mc:Ignorable="w14 w15 w16se w16cid w16 w16cex w16sdtdh w16sdtfl w16du wp14">
+<w:hdr xmlns:wpc="http://schemas.microsoft.com/office/word/2010/wordprocessingCanvas" xmlns:cx="http://schemas.microsoft.com/office/drawing/2014/chartex" xmlns:cx1="http://schemas.microsoft.com/office/drawing/2015/9/8/chartex" xmlns:cx2="http://schemas.microsoft.com/office/drawing/2015/10/21/chartex" xmlns:cx3="http://schemas.microsoft.com/office/drawing/2016/5/9/chartex" xmlns:cx4="http://schemas.microsoft.com/office/drawing/2016/5/10/chartex" xmlns:cx5="http://schemas.microsoft.com/office/drawing/2016/5/11/chartex" xmlns:cx6="http://schemas.microsoft.com/office/drawing/2016/5/12/chartex" xmlns:cx7="http://schemas.microsoft.com/office/drawing/2016/5/13/chartex" xmlns:cx8="http://schemas.microsoft.com/office/drawing/2016/5/14/chartex" xmlns:mc="http://schemas.openxmlformats.org/markup-compatibility/2006" xmlns:aink="http://schemas.microsoft.com/office/drawing/2016/ink" xmlns:am3d="http://schemas.microsoft.com/office/drawing/2017/model3d" xmlns:o="urn:schemas-microsoft-com:office:office" xmlns:oel="http://schemas.microsoft.com/office/2019/extlst" xmlns:r="http://schemas.openxmlformats.org/officeDocument/2006/relationships" xmlns:m="http://schemas.openxmlformats.org/officeDocument/2006/math" xmlns:v="urn:schemas-microsoft-com:vml" xmlns:wp14="http://schemas.microsoft.com/office/word/2010/wordprocessingDrawing" xmlns:wp="http://schemas.openxmlformats.org/drawingml/2006/wordprocessingDrawing" xmlns:w10="urn:schemas-microsoft-com:office:word" xmlns:w="http://schemas.openxmlformats.org/wordprocessingml/2006/main" xmlns:w14="http://schemas.microsoft.com/office/word/2010/wordml" xmlns:w15="http://schemas.microsoft.com/office/word/2012/wordml" xmlns:w16cex="http://schemas.microsoft.com/office/word/2018/wordml/cex" xmlns:w16cid="http://schemas.microsoft.com/office/word/2016/wordml/cid" xmlns:w16="http://schemas.microsoft.com/office/word/2018/wordml" xmlns:w16du="http://schemas.microsoft.com/office/word/2023/wordml/word16du" xmlns:w16sdtdh="http://schemas.microsoft.com/office/word/2020/wordml/sdtdatahash" xmlns:w16sdtfl="http://schemas.microsoft.com/office/word/2024/wordml/sdtformatlock" xmlns:w16se="http://schemas.microsoft.com/office/word/2015/wordml/symex" xmlns:wpg="http://schemas.microsoft.com/office/word/2010/wordprocessingGroup" xmlns:wpi="http://schemas.microsoft.com/office/word/2010/wordprocessingInk" xmlns:wne="http://schemas.microsoft.com/office/word/2006/wordml" xmlns:wps="http://schemas.microsoft.com/office/word/2010/wordprocessingShape" mc:Ignorable="w14 w15 w16se w16cid w16 w16cex w16sdtdh w16sdtfl w16du wp14">
   <w:p>
     <w:pPr>
       <w:jc w:val="right"/>
@@ -12388,12 +12872,98 @@
 </file>
 
 <file path=word/numbering.xml><?xml version="1.0" encoding="utf-8"?>
-<w:numbering xmlns:wpc="http://schemas.microsoft.com/office/word/2010/wordprocessingCanvas" xmlns:cx="http://schemas.microsoft.com/office/drawing/2014/chartex" xmlns:cx1="http://schemas.microsoft.com/office/drawing/2015/9/8/chartex" xmlns:cx2="http://schemas.microsoft.com/office/drawing/2015/10/21/chartex" xmlns:cx3="http://schemas.microsoft.com/office/drawing/2016/5/9/chartex" xmlns:cx4="http://schemas.microsoft.com/office/drawing/2016/5/10/chartex" xmlns:cx5="http://schemas.microsoft.com/office/drawing/2016/5/11/chartex" xmlns:cx6="http://schemas.microsoft.com/office/drawing/2016/5/12/chartex" xmlns:cx7="http://schemas.microsoft.com/office/drawing/2016/5/13/chartex" xmlns:cx8="http://schemas.microsoft.com/office/drawing/2016/5/14/chartex" xmlns:mc="http://schemas.openxmlformats.org/markup-compatibility/2006" xmlns:aink="http://schemas.microsoft.com/office/drawing/2016/ink" xmlns:am3d="http://schemas.microsoft.com/office/drawing/2017/model3d" xmlns:o="urn:schemas-microsoft-com:office:office" xmlns:oel="http://schemas.microsoft.com/office/2019/extlst" xmlns:r="http://schemas.openxmlformats.org/officeDocument/2006/relationships" xmlns:m="http://schemas.openxmlformats.org/officeDocument/2006/math" xmlns:v="urn:schemas-microsoft-com:vml" xmlns:wp14="http://schemas.microsoft.com/office/word/2010/wordprocessingDrawing" xmlns:wp="http://schemas.openxmlformats.org/drawingml/2006/wordprocessingDrawing" xmlns:w10="urn:schemas-microsoft-com:office:word" xmlns:w="http://schemas.openxmlformats.org/wordprocessingml/2006/main" xmlns:w14="http://schemas.microsoft.com/office/word/2010/wordml" xmlns:w15="http://schemas.microsoft.com/office/word/2012/wordml" xmlns:w16cei="http://schemas.microsoft.com/office/word/2026/wordml/cei" xmlns:w16cex="http://schemas.microsoft.com/office/word/2018/wordml/cex" xmlns:w16cid="http://schemas.microsoft.com/office/word/2016/wordml/cid" xmlns:w16="http://schemas.microsoft.com/office/word/2018/wordml" xmlns:w16du="http://schemas.microsoft.com/office/word/2023/wordml/word16du" xmlns:w16sdtdh="http://schemas.microsoft.com/office/word/2020/wordml/sdtdatahash" xmlns:w16sdtfl="http://schemas.microsoft.com/office/word/2024/wordml/sdtformatlock" xmlns:w16se="http://schemas.microsoft.com/office/word/2015/wordml/symex" xmlns:wpg="http://schemas.microsoft.com/office/word/2010/wordprocessingGroup" xmlns:wpi="http://schemas.microsoft.com/office/word/2010/wordprocessingInk" xmlns:wne="http://schemas.microsoft.com/office/word/2006/wordml" xmlns:wps="http://schemas.microsoft.com/office/word/2010/wordprocessingShape" mc:Ignorable="w14 w15 w16se w16cid w16 w16cex w16sdtdh w16sdtfl w16du wp14">
+<w:numbering xmlns:wpc="http://schemas.microsoft.com/office/word/2010/wordprocessingCanvas" xmlns:cx="http://schemas.microsoft.com/office/drawing/2014/chartex" xmlns:cx1="http://schemas.microsoft.com/office/drawing/2015/9/8/chartex" xmlns:cx2="http://schemas.microsoft.com/office/drawing/2015/10/21/chartex" xmlns:cx3="http://schemas.microsoft.com/office/drawing/2016/5/9/chartex" xmlns:cx4="http://schemas.microsoft.com/office/drawing/2016/5/10/chartex" xmlns:cx5="http://schemas.microsoft.com/office/drawing/2016/5/11/chartex" xmlns:cx6="http://schemas.microsoft.com/office/drawing/2016/5/12/chartex" xmlns:cx7="http://schemas.microsoft.com/office/drawing/2016/5/13/chartex" xmlns:cx8="http://schemas.microsoft.com/office/drawing/2016/5/14/chartex" xmlns:mc="http://schemas.openxmlformats.org/markup-compatibility/2006" xmlns:aink="http://schemas.microsoft.com/office/drawing/2016/ink" xmlns:am3d="http://schemas.microsoft.com/office/drawing/2017/model3d" xmlns:o="urn:schemas-microsoft-com:office:office" xmlns:oel="http://schemas.microsoft.com/office/2019/extlst" xmlns:r="http://schemas.openxmlformats.org/officeDocument/2006/relationships" xmlns:m="http://schemas.openxmlformats.org/officeDocument/2006/math" xmlns:v="urn:schemas-microsoft-com:vml" xmlns:wp14="http://schemas.microsoft.com/office/word/2010/wordprocessingDrawing" xmlns:wp="http://schemas.openxmlformats.org/drawingml/2006/wordprocessingDrawing" xmlns:w10="urn:schemas-microsoft-com:office:word" xmlns:w="http://schemas.openxmlformats.org/wordprocessingml/2006/main" xmlns:w14="http://schemas.microsoft.com/office/word/2010/wordml" xmlns:w15="http://schemas.microsoft.com/office/word/2012/wordml" xmlns:w16cex="http://schemas.microsoft.com/office/word/2018/wordml/cex" xmlns:w16cid="http://schemas.microsoft.com/office/word/2016/wordml/cid" xmlns:w16="http://schemas.microsoft.com/office/word/2018/wordml" xmlns:w16du="http://schemas.microsoft.com/office/word/2023/wordml/word16du" xmlns:w16sdtdh="http://schemas.microsoft.com/office/word/2020/wordml/sdtdatahash" xmlns:w16sdtfl="http://schemas.microsoft.com/office/word/2024/wordml/sdtformatlock" xmlns:w16se="http://schemas.microsoft.com/office/word/2015/wordml/symex" xmlns:wpg="http://schemas.microsoft.com/office/word/2010/wordprocessingGroup" xmlns:wpi="http://schemas.microsoft.com/office/word/2010/wordprocessingInk" xmlns:wne="http://schemas.microsoft.com/office/word/2006/wordml" xmlns:wps="http://schemas.microsoft.com/office/word/2010/wordprocessingShape" mc:Ignorable="w14 w15 w16se w16cid w16 w16cex w16sdtdh w16sdtfl w16du wp14">
   <w:abstractNum w:abstractNumId="0" w15:restartNumberingAfterBreak="0">
-    <w:nsid w:val="0BFE4123"/>
+    <w:nsid w:val="17DF0201"/>
     <w:multiLevelType w:val="hybridMultilevel"/>
-    <w:tmpl w:val="5E9623D8"/>
-    <w:lvl w:ilvl="0" w:tplc="6818D672">
+    <w:tmpl w:val="96FCB760"/>
+    <w:lvl w:ilvl="0" w:tplc="7FEE75E8">
+      <w:start w:val="1"/>
+      <w:numFmt w:val="bullet"/>
+      <w:lvlText w:val="●"/>
+      <w:lvlJc w:val="left"/>
+      <w:pPr>
+        <w:ind w:left="720" w:hanging="360"/>
+      </w:pPr>
+    </w:lvl>
+    <w:lvl w:ilvl="1" w:tplc="D0B65AEA">
+      <w:start w:val="1"/>
+      <w:numFmt w:val="bullet"/>
+      <w:lvlText w:val="○"/>
+      <w:lvlJc w:val="left"/>
+      <w:pPr>
+        <w:ind w:left="1440" w:hanging="360"/>
+      </w:pPr>
+    </w:lvl>
+    <w:lvl w:ilvl="2" w:tplc="5114C396">
+      <w:start w:val="1"/>
+      <w:numFmt w:val="bullet"/>
+      <w:lvlText w:val="■"/>
+      <w:lvlJc w:val="left"/>
+      <w:pPr>
+        <w:ind w:left="2160" w:hanging="360"/>
+      </w:pPr>
+    </w:lvl>
+    <w:lvl w:ilvl="3" w:tplc="FD36AC76">
+      <w:start w:val="1"/>
+      <w:numFmt w:val="bullet"/>
+      <w:lvlText w:val="●"/>
+      <w:lvlJc w:val="left"/>
+      <w:pPr>
+        <w:ind w:left="2880" w:hanging="360"/>
+      </w:pPr>
+    </w:lvl>
+    <w:lvl w:ilvl="4" w:tplc="BF4C5DD0">
+      <w:start w:val="1"/>
+      <w:numFmt w:val="bullet"/>
+      <w:lvlText w:val="○"/>
+      <w:lvlJc w:val="left"/>
+      <w:pPr>
+        <w:ind w:left="3600" w:hanging="360"/>
+      </w:pPr>
+    </w:lvl>
+    <w:lvl w:ilvl="5" w:tplc="51DE1E3A">
+      <w:start w:val="1"/>
+      <w:numFmt w:val="bullet"/>
+      <w:lvlText w:val="■"/>
+      <w:lvlJc w:val="left"/>
+      <w:pPr>
+        <w:ind w:left="4320" w:hanging="360"/>
+      </w:pPr>
+    </w:lvl>
+    <w:lvl w:ilvl="6" w:tplc="0DD4FA88">
+      <w:start w:val="1"/>
+      <w:numFmt w:val="bullet"/>
+      <w:lvlText w:val="●"/>
+      <w:lvlJc w:val="left"/>
+      <w:pPr>
+        <w:ind w:left="5040" w:hanging="360"/>
+      </w:pPr>
+    </w:lvl>
+    <w:lvl w:ilvl="7" w:tplc="FE721720">
+      <w:start w:val="1"/>
+      <w:numFmt w:val="bullet"/>
+      <w:lvlText w:val="●"/>
+      <w:lvlJc w:val="left"/>
+      <w:pPr>
+        <w:ind w:left="5760" w:hanging="360"/>
+      </w:pPr>
+    </w:lvl>
+    <w:lvl w:ilvl="8" w:tplc="6E96DF50">
+      <w:start w:val="1"/>
+      <w:numFmt w:val="bullet"/>
+      <w:lvlText w:val="●"/>
+      <w:lvlJc w:val="left"/>
+      <w:pPr>
+        <w:ind w:left="6480" w:hanging="360"/>
+      </w:pPr>
+    </w:lvl>
+  </w:abstractNum>
+  <w:abstractNum w:abstractNumId="1" w15:restartNumberingAfterBreak="0">
+    <w:nsid w:val="1CA10323"/>
+    <w:multiLevelType w:val="hybridMultilevel"/>
+    <w:tmpl w:val="2594EBE4"/>
+    <w:lvl w:ilvl="0" w:tplc="1A208A02">
       <w:start w:val="1"/>
       <w:numFmt w:val="decimal"/>
       <w:lvlText w:val="%1."/>
@@ -12402,213 +12972,127 @@
         <w:ind w:left="560" w:hanging="320"/>
       </w:pPr>
     </w:lvl>
-    <w:lvl w:ilvl="1" w:tplc="8BBE9BA0">
+    <w:lvl w:ilvl="1" w:tplc="0DFA9C4C">
       <w:numFmt w:val="decimal"/>
       <w:lvlText w:val=""/>
       <w:lvlJc w:val="left"/>
     </w:lvl>
-    <w:lvl w:ilvl="2" w:tplc="EB48DC6E">
+    <w:lvl w:ilvl="2" w:tplc="866EAB34">
       <w:numFmt w:val="decimal"/>
       <w:lvlText w:val=""/>
       <w:lvlJc w:val="left"/>
     </w:lvl>
-    <w:lvl w:ilvl="3" w:tplc="F8A44F44">
+    <w:lvl w:ilvl="3" w:tplc="7864F0E2">
       <w:numFmt w:val="decimal"/>
       <w:lvlText w:val=""/>
       <w:lvlJc w:val="left"/>
     </w:lvl>
-    <w:lvl w:ilvl="4" w:tplc="767E2EC8">
+    <w:lvl w:ilvl="4" w:tplc="A300D712">
       <w:numFmt w:val="decimal"/>
       <w:lvlText w:val=""/>
       <w:lvlJc w:val="left"/>
     </w:lvl>
-    <w:lvl w:ilvl="5" w:tplc="0178C3C8">
+    <w:lvl w:ilvl="5" w:tplc="46E89E04">
       <w:numFmt w:val="decimal"/>
       <w:lvlText w:val=""/>
       <w:lvlJc w:val="left"/>
     </w:lvl>
-    <w:lvl w:ilvl="6" w:tplc="7012CEF6">
+    <w:lvl w:ilvl="6" w:tplc="928C8C82">
       <w:numFmt w:val="decimal"/>
       <w:lvlText w:val=""/>
       <w:lvlJc w:val="left"/>
     </w:lvl>
-    <w:lvl w:ilvl="7" w:tplc="2A043CEE">
+    <w:lvl w:ilvl="7" w:tplc="F746E4B2">
       <w:numFmt w:val="decimal"/>
       <w:lvlText w:val=""/>
       <w:lvlJc w:val="left"/>
     </w:lvl>
-    <w:lvl w:ilvl="8" w:tplc="C68C82DC">
-      <w:numFmt w:val="decimal"/>
-      <w:lvlText w:val=""/>
-      <w:lvlJc w:val="left"/>
-    </w:lvl>
-  </w:abstractNum>
-  <w:abstractNum w:abstractNumId="1" w15:restartNumberingAfterBreak="0">
-    <w:nsid w:val="3CD90F0D"/>
-    <w:multiLevelType w:val="hybridMultilevel"/>
-    <w:tmpl w:val="4830AD4A"/>
-    <w:lvl w:ilvl="0" w:tplc="A22C198C">
-      <w:start w:val="1"/>
-      <w:numFmt w:val="bullet"/>
-      <w:lvlText w:val="•"/>
-      <w:lvlJc w:val="left"/>
-      <w:pPr>
-        <w:ind w:left="560" w:hanging="280"/>
-      </w:pPr>
-    </w:lvl>
-    <w:lvl w:ilvl="1" w:tplc="6D62D2C8">
-      <w:numFmt w:val="decimal"/>
-      <w:lvlText w:val=""/>
-      <w:lvlJc w:val="left"/>
-    </w:lvl>
-    <w:lvl w:ilvl="2" w:tplc="C37ACA0E">
-      <w:numFmt w:val="decimal"/>
-      <w:lvlText w:val=""/>
-      <w:lvlJc w:val="left"/>
-    </w:lvl>
-    <w:lvl w:ilvl="3" w:tplc="F9ACC5D4">
-      <w:numFmt w:val="decimal"/>
-      <w:lvlText w:val=""/>
-      <w:lvlJc w:val="left"/>
-    </w:lvl>
-    <w:lvl w:ilvl="4" w:tplc="DD4A1300">
-      <w:numFmt w:val="decimal"/>
-      <w:lvlText w:val=""/>
-      <w:lvlJc w:val="left"/>
-    </w:lvl>
-    <w:lvl w:ilvl="5" w:tplc="40544B64">
-      <w:numFmt w:val="decimal"/>
-      <w:lvlText w:val=""/>
-      <w:lvlJc w:val="left"/>
-    </w:lvl>
-    <w:lvl w:ilvl="6" w:tplc="CC8CB1E4">
-      <w:numFmt w:val="decimal"/>
-      <w:lvlText w:val=""/>
-      <w:lvlJc w:val="left"/>
-    </w:lvl>
-    <w:lvl w:ilvl="7" w:tplc="125A441C">
-      <w:numFmt w:val="decimal"/>
-      <w:lvlText w:val=""/>
-      <w:lvlJc w:val="left"/>
-    </w:lvl>
-    <w:lvl w:ilvl="8" w:tplc="42FAE704">
+    <w:lvl w:ilvl="8" w:tplc="320ED236">
       <w:numFmt w:val="decimal"/>
       <w:lvlText w:val=""/>
       <w:lvlJc w:val="left"/>
     </w:lvl>
   </w:abstractNum>
   <w:abstractNum w:abstractNumId="2" w15:restartNumberingAfterBreak="0">
-    <w:nsid w:val="5B156E8D"/>
+    <w:nsid w:val="460D30A9"/>
     <w:multiLevelType w:val="hybridMultilevel"/>
-    <w:tmpl w:val="A92EC506"/>
-    <w:lvl w:ilvl="0" w:tplc="F87C3F7A">
+    <w:tmpl w:val="E362CF7C"/>
+    <w:lvl w:ilvl="0" w:tplc="7EC84CB2">
       <w:start w:val="1"/>
       <w:numFmt w:val="bullet"/>
-      <w:lvlText w:val="●"/>
+      <w:lvlText w:val="•"/>
       <w:lvlJc w:val="left"/>
       <w:pPr>
-        <w:ind w:left="720" w:hanging="360"/>
+        <w:ind w:left="560" w:hanging="280"/>
       </w:pPr>
     </w:lvl>
-    <w:lvl w:ilvl="1" w:tplc="B62EAD58">
-      <w:start w:val="1"/>
-      <w:numFmt w:val="bullet"/>
-      <w:lvlText w:val="○"/>
+    <w:lvl w:ilvl="1" w:tplc="9B489F46">
+      <w:numFmt w:val="decimal"/>
+      <w:lvlText w:val=""/>
       <w:lvlJc w:val="left"/>
-      <w:pPr>
-        <w:ind w:left="1440" w:hanging="360"/>
-      </w:pPr>
     </w:lvl>
-    <w:lvl w:ilvl="2" w:tplc="98B0098C">
-      <w:start w:val="1"/>
-      <w:numFmt w:val="bullet"/>
-      <w:lvlText w:val="■"/>
+    <w:lvl w:ilvl="2" w:tplc="BDDE6FA0">
+      <w:numFmt w:val="decimal"/>
+      <w:lvlText w:val=""/>
       <w:lvlJc w:val="left"/>
-      <w:pPr>
-        <w:ind w:left="2160" w:hanging="360"/>
-      </w:pPr>
     </w:lvl>
-    <w:lvl w:ilvl="3" w:tplc="A66E7274">
-      <w:start w:val="1"/>
-      <w:numFmt w:val="bullet"/>
-      <w:lvlText w:val="●"/>
+    <w:lvl w:ilvl="3" w:tplc="B0B22708">
+      <w:numFmt w:val="decimal"/>
+      <w:lvlText w:val=""/>
       <w:lvlJc w:val="left"/>
-      <w:pPr>
-        <w:ind w:left="2880" w:hanging="360"/>
-      </w:pPr>
     </w:lvl>
-    <w:lvl w:ilvl="4" w:tplc="4C3E46CC">
-      <w:start w:val="1"/>
-      <w:numFmt w:val="bullet"/>
-      <w:lvlText w:val="○"/>
+    <w:lvl w:ilvl="4" w:tplc="DAEC3D4A">
+      <w:numFmt w:val="decimal"/>
+      <w:lvlText w:val=""/>
       <w:lvlJc w:val="left"/>
-      <w:pPr>
-        <w:ind w:left="3600" w:hanging="360"/>
-      </w:pPr>
     </w:lvl>
-    <w:lvl w:ilvl="5" w:tplc="728CD142">
-      <w:start w:val="1"/>
-      <w:numFmt w:val="bullet"/>
-      <w:lvlText w:val="■"/>
+    <w:lvl w:ilvl="5" w:tplc="8E3C3AF8">
+      <w:numFmt w:val="decimal"/>
+      <w:lvlText w:val=""/>
       <w:lvlJc w:val="left"/>
-      <w:pPr>
-        <w:ind w:left="4320" w:hanging="360"/>
-      </w:pPr>
     </w:lvl>
-    <w:lvl w:ilvl="6" w:tplc="560EF06E">
-      <w:start w:val="1"/>
-      <w:numFmt w:val="bullet"/>
-      <w:lvlText w:val="●"/>
+    <w:lvl w:ilvl="6" w:tplc="9EACA82C">
+      <w:numFmt w:val="decimal"/>
+      <w:lvlText w:val=""/>
       <w:lvlJc w:val="left"/>
-      <w:pPr>
-        <w:ind w:left="5040" w:hanging="360"/>
-      </w:pPr>
     </w:lvl>
-    <w:lvl w:ilvl="7" w:tplc="587CE9EA">
-      <w:start w:val="1"/>
-      <w:numFmt w:val="bullet"/>
-      <w:lvlText w:val="●"/>
+    <w:lvl w:ilvl="7" w:tplc="0C428F4E">
+      <w:numFmt w:val="decimal"/>
+      <w:lvlText w:val=""/>
       <w:lvlJc w:val="left"/>
-      <w:pPr>
-        <w:ind w:left="5760" w:hanging="360"/>
-      </w:pPr>
     </w:lvl>
-    <w:lvl w:ilvl="8" w:tplc="40CE93C0">
-      <w:start w:val="1"/>
-      <w:numFmt w:val="bullet"/>
-      <w:lvlText w:val="●"/>
+    <w:lvl w:ilvl="8" w:tplc="4C084BAC">
+      <w:numFmt w:val="decimal"/>
+      <w:lvlText w:val=""/>
       <w:lvlJc w:val="left"/>
-      <w:pPr>
-        <w:ind w:left="6480" w:hanging="360"/>
-      </w:pPr>
     </w:lvl>
   </w:abstractNum>
-  <w:num w:numId="1" w16cid:durableId="1729304651">
+  <w:num w:numId="1" w16cid:durableId="1975938772">
+    <w:abstractNumId w:val="0"/>
+    <w:lvlOverride w:ilvl="0">
+      <w:startOverride w:val="1"/>
+    </w:lvlOverride>
+  </w:num>
+  <w:num w:numId="2" w16cid:durableId="1654483678">
     <w:abstractNumId w:val="2"/>
     <w:lvlOverride w:ilvl="0">
       <w:startOverride w:val="1"/>
     </w:lvlOverride>
   </w:num>
-  <w:num w:numId="2" w16cid:durableId="556205499">
+  <w:num w:numId="3" w16cid:durableId="971054126">
     <w:abstractNumId w:val="1"/>
     <w:lvlOverride w:ilvl="0">
       <w:startOverride w:val="1"/>
     </w:lvlOverride>
   </w:num>
-  <w:num w:numId="3" w16cid:durableId="383868872">
-    <w:abstractNumId w:val="0"/>
+  <w:num w:numId="4" w16cid:durableId="1326006889">
+    <w:abstractNumId w:val="1"/>
     <w:lvlOverride w:ilvl="0">
       <w:startOverride w:val="1"/>
     </w:lvlOverride>
   </w:num>
-  <w:num w:numId="4" w16cid:durableId="1498956790">
-    <w:abstractNumId w:val="0"/>
-    <w:lvlOverride w:ilvl="0">
-      <w:startOverride w:val="1"/>
-    </w:lvlOverride>
-  </w:num>
-  <w:num w:numId="5" w16cid:durableId="227613064">
-    <w:abstractNumId w:val="0"/>
+  <w:num w:numId="5" w16cid:durableId="843395088">
+    <w:abstractNumId w:val="1"/>
     <w:lvlOverride w:ilvl="0">
       <w:startOverride w:val="1"/>
     </w:lvlOverride>
@@ -13219,7 +13703,7 @@
     <w:autoRedefine/>
     <w:uiPriority w:val="39"/>
     <w:unhideWhenUsed/>
-    <w:rsid w:val="00EE6687"/>
+    <w:rsid w:val="00CE7055"/>
     <w:pPr>
       <w:spacing w:after="100"/>
     </w:pPr>
@@ -13231,7 +13715,7 @@
     <w:autoRedefine/>
     <w:uiPriority w:val="39"/>
     <w:unhideWhenUsed/>
-    <w:rsid w:val="00EE6687"/>
+    <w:rsid w:val="00CE7055"/>
     <w:pPr>
       <w:spacing w:after="100"/>
       <w:ind w:left="220"/>

</xml_diff>